<commit_message>
dopolnjena dokumentacija glede na dodatke ui
</commit_message>
<xml_diff>
--- a/docs/dokumentacija.docx
+++ b/docs/dokumentacija.docx
@@ -343,7 +343,7 @@
           <w:r>
             <w:fldChar w:fldCharType="separate"/>
           </w:r>
-          <w:hyperlink w:anchor="_Toc199948507" w:history="1">
+          <w:hyperlink w:anchor="_Toc200298672" w:history="1">
             <w:r>
               <w:rPr>
                 <w:rStyle w:val="Hiperpovezava"/>
@@ -370,7 +370,7 @@
                 <w:noProof/>
                 <w:webHidden/>
               </w:rPr>
-              <w:instrText xml:space="preserve"> PAGEREF _Toc199948507 \h </w:instrText>
+              <w:instrText xml:space="preserve"> PAGEREF _Toc200298672 \h </w:instrText>
             </w:r>
             <w:r>
               <w:rPr>
@@ -415,7 +415,7 @@
               <w:lang w:eastAsia="sl-SI"/>
             </w:rPr>
           </w:pPr>
-          <w:hyperlink w:anchor="_Toc199948508" w:history="1">
+          <w:hyperlink w:anchor="_Toc200298673" w:history="1">
             <w:r>
               <w:rPr>
                 <w:rStyle w:val="Hiperpovezava"/>
@@ -442,7 +442,7 @@
                 <w:noProof/>
                 <w:webHidden/>
               </w:rPr>
-              <w:instrText xml:space="preserve"> PAGEREF _Toc199948508 \h </w:instrText>
+              <w:instrText xml:space="preserve"> PAGEREF _Toc200298673 \h </w:instrText>
             </w:r>
             <w:r>
               <w:rPr>
@@ -480,10 +480,14 @@
               <w:tab w:val="right" w:leader="dot" w:pos="9062"/>
             </w:tabs>
             <w:rPr>
+              <w:rFonts w:eastAsiaTheme="minorEastAsia"/>
               <w:noProof/>
+              <w:sz w:val="24"/>
+              <w:szCs w:val="24"/>
+              <w:lang w:eastAsia="sl-SI"/>
             </w:rPr>
           </w:pPr>
-          <w:hyperlink w:anchor="_Toc199948509" w:history="1">
+          <w:hyperlink w:anchor="_Toc200298674" w:history="1">
             <w:r>
               <w:rPr>
                 <w:rStyle w:val="Hiperpovezava"/>
@@ -510,7 +514,7 @@
                 <w:noProof/>
                 <w:webHidden/>
               </w:rPr>
-              <w:instrText xml:space="preserve"> PAGEREF _Toc199948509 \h </w:instrText>
+              <w:instrText xml:space="preserve"> PAGEREF _Toc200298674 \h </w:instrText>
             </w:r>
             <w:r>
               <w:rPr>
@@ -548,10 +552,14 @@
               <w:tab w:val="right" w:leader="dot" w:pos="9062"/>
             </w:tabs>
             <w:rPr>
+              <w:rFonts w:eastAsiaTheme="minorEastAsia"/>
               <w:noProof/>
+              <w:sz w:val="24"/>
+              <w:szCs w:val="24"/>
+              <w:lang w:eastAsia="sl-SI"/>
             </w:rPr>
           </w:pPr>
-          <w:hyperlink w:anchor="_Toc199948510" w:history="1">
+          <w:hyperlink w:anchor="_Toc200298675" w:history="1">
             <w:r>
               <w:rPr>
                 <w:rStyle w:val="Hiperpovezava"/>
@@ -578,7 +586,7 @@
                 <w:noProof/>
                 <w:webHidden/>
               </w:rPr>
-              <w:instrText xml:space="preserve"> PAGEREF _Toc199948510 \h </w:instrText>
+              <w:instrText xml:space="preserve"> PAGEREF _Toc200298675 \h </w:instrText>
             </w:r>
             <w:r>
               <w:rPr>
@@ -623,7 +631,7 @@
               <w:lang w:eastAsia="sl-SI"/>
             </w:rPr>
           </w:pPr>
-          <w:hyperlink w:anchor="_Toc199948511" w:history="1">
+          <w:hyperlink w:anchor="_Toc200298676" w:history="1">
             <w:r>
               <w:rPr>
                 <w:rStyle w:val="Hiperpovezava"/>
@@ -650,7 +658,7 @@
                 <w:noProof/>
                 <w:webHidden/>
               </w:rPr>
-              <w:instrText xml:space="preserve"> PAGEREF _Toc199948511 \h </w:instrText>
+              <w:instrText xml:space="preserve"> PAGEREF _Toc200298676 \h </w:instrText>
             </w:r>
             <w:r>
               <w:rPr>
@@ -695,7 +703,7 @@
               <w:lang w:eastAsia="sl-SI"/>
             </w:rPr>
           </w:pPr>
-          <w:hyperlink w:anchor="_Toc199948512" w:history="1">
+          <w:hyperlink w:anchor="_Toc200298677" w:history="1">
             <w:r>
               <w:rPr>
                 <w:rStyle w:val="Hiperpovezava"/>
@@ -722,7 +730,7 @@
                 <w:noProof/>
                 <w:webHidden/>
               </w:rPr>
-              <w:instrText xml:space="preserve"> PAGEREF _Toc199948512 \h </w:instrText>
+              <w:instrText xml:space="preserve"> PAGEREF _Toc200298677 \h </w:instrText>
             </w:r>
             <w:r>
               <w:rPr>
@@ -767,7 +775,7 @@
               <w:lang w:eastAsia="sl-SI"/>
             </w:rPr>
           </w:pPr>
-          <w:hyperlink w:anchor="_Toc199948513" w:history="1">
+          <w:hyperlink w:anchor="_Toc200298678" w:history="1">
             <w:r>
               <w:rPr>
                 <w:rStyle w:val="Hiperpovezava"/>
@@ -794,7 +802,7 @@
                 <w:noProof/>
                 <w:webHidden/>
               </w:rPr>
-              <w:instrText xml:space="preserve"> PAGEREF _Toc199948513 \h </w:instrText>
+              <w:instrText xml:space="preserve"> PAGEREF _Toc200298678 \h </w:instrText>
             </w:r>
             <w:r>
               <w:rPr>
@@ -839,7 +847,7 @@
               <w:lang w:eastAsia="sl-SI"/>
             </w:rPr>
           </w:pPr>
-          <w:hyperlink w:anchor="_Toc199948514" w:history="1">
+          <w:hyperlink w:anchor="_Toc200298679" w:history="1">
             <w:r>
               <w:rPr>
                 <w:rStyle w:val="Hiperpovezava"/>
@@ -866,7 +874,7 @@
                 <w:noProof/>
                 <w:webHidden/>
               </w:rPr>
-              <w:instrText xml:space="preserve"> PAGEREF _Toc199948514 \h </w:instrText>
+              <w:instrText xml:space="preserve"> PAGEREF _Toc200298679 \h </w:instrText>
             </w:r>
             <w:r>
               <w:rPr>
@@ -904,10 +912,14 @@
               <w:tab w:val="right" w:leader="dot" w:pos="9062"/>
             </w:tabs>
             <w:rPr>
+              <w:rFonts w:eastAsiaTheme="minorEastAsia"/>
               <w:noProof/>
+              <w:sz w:val="24"/>
+              <w:szCs w:val="24"/>
+              <w:lang w:eastAsia="sl-SI"/>
             </w:rPr>
           </w:pPr>
-          <w:hyperlink w:anchor="_Toc199948515" w:history="1">
+          <w:hyperlink w:anchor="_Toc200298680" w:history="1">
             <w:r>
               <w:rPr>
                 <w:rStyle w:val="Hiperpovezava"/>
@@ -934,7 +946,7 @@
                 <w:noProof/>
                 <w:webHidden/>
               </w:rPr>
-              <w:instrText xml:space="preserve"> PAGEREF _Toc199948515 \h </w:instrText>
+              <w:instrText xml:space="preserve"> PAGEREF _Toc200298680 \h </w:instrText>
             </w:r>
             <w:r>
               <w:rPr>
@@ -972,10 +984,14 @@
               <w:tab w:val="right" w:leader="dot" w:pos="9062"/>
             </w:tabs>
             <w:rPr>
+              <w:rFonts w:eastAsiaTheme="minorEastAsia"/>
               <w:noProof/>
+              <w:sz w:val="24"/>
+              <w:szCs w:val="24"/>
+              <w:lang w:eastAsia="sl-SI"/>
             </w:rPr>
           </w:pPr>
-          <w:hyperlink w:anchor="_Toc199948516" w:history="1">
+          <w:hyperlink w:anchor="_Toc200298681" w:history="1">
             <w:r>
               <w:rPr>
                 <w:rStyle w:val="Hiperpovezava"/>
@@ -1002,7 +1018,7 @@
                 <w:noProof/>
                 <w:webHidden/>
               </w:rPr>
-              <w:instrText xml:space="preserve"> PAGEREF _Toc199948516 \h </w:instrText>
+              <w:instrText xml:space="preserve"> PAGEREF _Toc200298681 \h </w:instrText>
             </w:r>
             <w:r>
               <w:rPr>
@@ -1040,10 +1056,14 @@
               <w:tab w:val="right" w:leader="dot" w:pos="9062"/>
             </w:tabs>
             <w:rPr>
+              <w:rFonts w:eastAsiaTheme="minorEastAsia"/>
               <w:noProof/>
+              <w:sz w:val="24"/>
+              <w:szCs w:val="24"/>
+              <w:lang w:eastAsia="sl-SI"/>
             </w:rPr>
           </w:pPr>
-          <w:hyperlink w:anchor="_Toc199948517" w:history="1">
+          <w:hyperlink w:anchor="_Toc200298682" w:history="1">
             <w:r>
               <w:rPr>
                 <w:rStyle w:val="Hiperpovezava"/>
@@ -1070,7 +1090,7 @@
                 <w:noProof/>
                 <w:webHidden/>
               </w:rPr>
-              <w:instrText xml:space="preserve"> PAGEREF _Toc199948517 \h </w:instrText>
+              <w:instrText xml:space="preserve"> PAGEREF _Toc200298682 \h </w:instrText>
             </w:r>
             <w:r>
               <w:rPr>
@@ -1115,7 +1135,7 @@
               <w:lang w:eastAsia="sl-SI"/>
             </w:rPr>
           </w:pPr>
-          <w:hyperlink w:anchor="_Toc199948518" w:history="1">
+          <w:hyperlink w:anchor="_Toc200298683" w:history="1">
             <w:r>
               <w:rPr>
                 <w:rStyle w:val="Hiperpovezava"/>
@@ -1142,7 +1162,7 @@
                 <w:noProof/>
                 <w:webHidden/>
               </w:rPr>
-              <w:instrText xml:space="preserve"> PAGEREF _Toc199948518 \h </w:instrText>
+              <w:instrText xml:space="preserve"> PAGEREF _Toc200298683 \h </w:instrText>
             </w:r>
             <w:r>
               <w:rPr>
@@ -1187,7 +1207,7 @@
               <w:lang w:eastAsia="sl-SI"/>
             </w:rPr>
           </w:pPr>
-          <w:hyperlink w:anchor="_Toc199948519" w:history="1">
+          <w:hyperlink w:anchor="_Toc200298684" w:history="1">
             <w:r>
               <w:rPr>
                 <w:rStyle w:val="Hiperpovezava"/>
@@ -1214,7 +1234,7 @@
                 <w:noProof/>
                 <w:webHidden/>
               </w:rPr>
-              <w:instrText xml:space="preserve"> PAGEREF _Toc199948519 \h </w:instrText>
+              <w:instrText xml:space="preserve"> PAGEREF _Toc200298684 \h </w:instrText>
             </w:r>
             <w:r>
               <w:rPr>
@@ -1259,7 +1279,7 @@
               <w:lang w:eastAsia="sl-SI"/>
             </w:rPr>
           </w:pPr>
-          <w:hyperlink w:anchor="_Toc199948520" w:history="1">
+          <w:hyperlink w:anchor="_Toc200298685" w:history="1">
             <w:r>
               <w:rPr>
                 <w:rStyle w:val="Hiperpovezava"/>
@@ -1286,7 +1306,7 @@
                 <w:noProof/>
                 <w:webHidden/>
               </w:rPr>
-              <w:instrText xml:space="preserve"> PAGEREF _Toc199948520 \h </w:instrText>
+              <w:instrText xml:space="preserve"> PAGEREF _Toc200298685 \h </w:instrText>
             </w:r>
             <w:r>
               <w:rPr>
@@ -1331,7 +1351,7 @@
               <w:lang w:eastAsia="sl-SI"/>
             </w:rPr>
           </w:pPr>
-          <w:hyperlink w:anchor="_Toc199948521" w:history="1">
+          <w:hyperlink w:anchor="_Toc200298686" w:history="1">
             <w:r>
               <w:rPr>
                 <w:rStyle w:val="Hiperpovezava"/>
@@ -1358,7 +1378,7 @@
                 <w:noProof/>
                 <w:webHidden/>
               </w:rPr>
-              <w:instrText xml:space="preserve"> PAGEREF _Toc199948521 \h </w:instrText>
+              <w:instrText xml:space="preserve"> PAGEREF _Toc200298686 \h </w:instrText>
             </w:r>
             <w:r>
               <w:rPr>
@@ -1403,7 +1423,7 @@
               <w:lang w:eastAsia="sl-SI"/>
             </w:rPr>
           </w:pPr>
-          <w:hyperlink w:anchor="_Toc199948522" w:history="1">
+          <w:hyperlink w:anchor="_Toc200298687" w:history="1">
             <w:r>
               <w:rPr>
                 <w:rStyle w:val="Hiperpovezava"/>
@@ -1430,7 +1450,7 @@
                 <w:noProof/>
                 <w:webHidden/>
               </w:rPr>
-              <w:instrText xml:space="preserve"> PAGEREF _Toc199948522 \h </w:instrText>
+              <w:instrText xml:space="preserve"> PAGEREF _Toc200298687 \h </w:instrText>
             </w:r>
             <w:r>
               <w:rPr>
@@ -1475,7 +1495,7 @@
               <w:lang w:eastAsia="sl-SI"/>
             </w:rPr>
           </w:pPr>
-          <w:hyperlink w:anchor="_Toc199948523" w:history="1">
+          <w:hyperlink w:anchor="_Toc200298688" w:history="1">
             <w:r>
               <w:rPr>
                 <w:rStyle w:val="Hiperpovezava"/>
@@ -1502,7 +1522,7 @@
                 <w:noProof/>
                 <w:webHidden/>
               </w:rPr>
-              <w:instrText xml:space="preserve"> PAGEREF _Toc199948523 \h </w:instrText>
+              <w:instrText xml:space="preserve"> PAGEREF _Toc200298688 \h </w:instrText>
             </w:r>
             <w:r>
               <w:rPr>
@@ -1644,7 +1664,7 @@
       <w:pPr>
         <w:pStyle w:val="Naslov1"/>
       </w:pPr>
-      <w:bookmarkStart w:id="0" w:name="_Toc199948507"/>
+      <w:bookmarkStart w:id="0" w:name="_Toc200298672"/>
       <w:r>
         <w:lastRenderedPageBreak/>
         <w:t>Opis funkcionalnosti rešitv</w:t>
@@ -2325,7 +2345,7 @@
       <w:pPr>
         <w:pStyle w:val="Naslov1"/>
       </w:pPr>
-      <w:bookmarkStart w:id="1" w:name="_Toc199948508"/>
+      <w:bookmarkStart w:id="1" w:name="_Toc200298673"/>
       <w:r>
         <w:lastRenderedPageBreak/>
         <w:t>Arhitektura in komponente rešitve</w:t>
@@ -2337,7 +2357,7 @@
       <w:pPr>
         <w:pStyle w:val="Naslov2"/>
       </w:pPr>
-      <w:bookmarkStart w:id="2" w:name="_Toc199948509"/>
+      <w:bookmarkStart w:id="2" w:name="_Toc200298674"/>
       <w:r>
         <w:t>Uporabljene t</w:t>
       </w:r>
@@ -2879,7 +2899,7 @@
       <w:pPr>
         <w:pStyle w:val="Naslov2"/>
       </w:pPr>
-      <w:bookmarkStart w:id="3" w:name="_Toc199948510"/>
+      <w:bookmarkStart w:id="3" w:name="_Toc200298675"/>
       <w:r>
         <w:lastRenderedPageBreak/>
         <w:t>Glavne komponente</w:t>
@@ -4531,7 +4551,7 @@
       <w:pPr>
         <w:pStyle w:val="Naslov1"/>
       </w:pPr>
-      <w:bookmarkStart w:id="4" w:name="_Toc199948511"/>
+      <w:bookmarkStart w:id="4" w:name="_Toc200298676"/>
       <w:r>
         <w:lastRenderedPageBreak/>
         <w:t>Simuliran zaledni sistem in operaterska platforma</w:t>
@@ -5023,7 +5043,7 @@
       <w:pPr>
         <w:pStyle w:val="Naslov1"/>
       </w:pPr>
-      <w:bookmarkStart w:id="5" w:name="_Toc199948512"/>
+      <w:bookmarkStart w:id="5" w:name="_Toc200298677"/>
       <w:r>
         <w:lastRenderedPageBreak/>
         <w:t>REST vmesnik</w:t>
@@ -5092,7 +5112,7 @@
       <w:pPr>
         <w:pStyle w:val="Naslov1"/>
       </w:pPr>
-      <w:bookmarkStart w:id="6" w:name="_Toc199948513"/>
+      <w:bookmarkStart w:id="6" w:name="_Toc200298678"/>
       <w:proofErr w:type="spellStart"/>
       <w:r>
         <w:lastRenderedPageBreak/>
@@ -5136,7 +5156,7 @@
       <w:pPr>
         <w:pStyle w:val="Naslov1"/>
       </w:pPr>
-      <w:bookmarkStart w:id="7" w:name="_Toc199948514"/>
+      <w:bookmarkStart w:id="7" w:name="_Toc200298679"/>
       <w:r>
         <w:lastRenderedPageBreak/>
         <w:t>Struktura uporabniških vmesnikov</w:t>
@@ -5148,7 +5168,7 @@
       <w:pPr>
         <w:pStyle w:val="Naslov2"/>
       </w:pPr>
-      <w:bookmarkStart w:id="8" w:name="_Toc199948515"/>
+      <w:bookmarkStart w:id="8" w:name="_Toc200298680"/>
       <w:r>
         <w:t>Začetni zaslon</w:t>
       </w:r>
@@ -5226,6 +5246,80 @@
           <w:sz w:val="24"/>
           <w:szCs w:val="24"/>
         </w:rPr>
+        <w:t>Navodila za igro</w:t>
+      </w:r>
+    </w:p>
+    <w:p>
+      <w:pPr>
+        <w:pStyle w:val="Odstavekseznama"/>
+        <w:numPr>
+          <w:ilvl w:val="0"/>
+          <w:numId w:val="41"/>
+        </w:numPr>
+        <w:rPr>
+          <w:sz w:val="24"/>
+          <w:szCs w:val="24"/>
+        </w:rPr>
+      </w:pPr>
+      <w:r>
+        <w:rPr>
+          <w:b/>
+          <w:bCs/>
+          <w:sz w:val="24"/>
+          <w:szCs w:val="24"/>
+        </w:rPr>
+        <w:t>Skupna statistika</w:t>
+      </w:r>
+      <w:r>
+        <w:rPr>
+          <w:sz w:val="24"/>
+          <w:szCs w:val="24"/>
+        </w:rPr>
+        <w:t xml:space="preserve"> </w:t>
+      </w:r>
+      <w:r>
+        <w:rPr>
+          <w:sz w:val="24"/>
+          <w:szCs w:val="24"/>
+        </w:rPr>
+        <w:t>–</w:t>
+      </w:r>
+      <w:r>
+        <w:rPr>
+          <w:b/>
+          <w:bCs/>
+          <w:sz w:val="24"/>
+          <w:szCs w:val="24"/>
+        </w:rPr>
+        <w:t xml:space="preserve"> </w:t>
+      </w:r>
+      <w:r>
+        <w:rPr>
+          <w:sz w:val="24"/>
+          <w:szCs w:val="24"/>
+        </w:rPr>
+        <w:t>skupno število doseženih točk, število odigranih iger, povprečje točk na igro</w:t>
+      </w:r>
+    </w:p>
+    <w:p>
+      <w:pPr>
+        <w:pStyle w:val="Odstavekseznama"/>
+        <w:numPr>
+          <w:ilvl w:val="0"/>
+          <w:numId w:val="41"/>
+        </w:numPr>
+        <w:rPr>
+          <w:sz w:val="24"/>
+          <w:szCs w:val="24"/>
+        </w:rPr>
+      </w:pPr>
+      <w:r>
+        <w:rPr>
+          <w:b/>
+          <w:bCs/>
+          <w:sz w:val="24"/>
+          <w:szCs w:val="24"/>
+        </w:rPr>
         <w:t>Izbor težavnosti</w:t>
       </w:r>
       <w:r>
@@ -5517,7 +5611,7 @@
       <w:pPr>
         <w:pStyle w:val="Naslov2"/>
       </w:pPr>
-      <w:bookmarkStart w:id="9" w:name="_Toc199948516"/>
+      <w:bookmarkStart w:id="9" w:name="_Toc200298681"/>
       <w:r>
         <w:t>Zaslon igre</w:t>
       </w:r>
@@ -5587,14 +5681,7 @@
           <w:sz w:val="24"/>
           <w:szCs w:val="24"/>
         </w:rPr>
-        <w:t>Števec časa</w:t>
-      </w:r>
-      <w:r>
-        <w:rPr>
-          <w:sz w:val="24"/>
-          <w:szCs w:val="24"/>
-        </w:rPr>
-        <w:t xml:space="preserve"> - prikaz pretečenega časa v formatu MM:SS</w:t>
+        <w:t>Naslov aplikacije</w:t>
       </w:r>
     </w:p>
     <w:p>
@@ -5616,59 +5703,8 @@
           <w:sz w:val="24"/>
           <w:szCs w:val="24"/>
         </w:rPr>
-        <w:t>Prikaži rešitev</w:t>
-      </w:r>
-      <w:r>
-        <w:rPr>
-          <w:sz w:val="24"/>
-          <w:szCs w:val="24"/>
-        </w:rPr>
-        <w:t xml:space="preserve"> </w:t>
-      </w:r>
-      <w:r>
-        <w:rPr>
-          <w:sz w:val="24"/>
-          <w:szCs w:val="24"/>
-        </w:rPr>
-        <w:t>–</w:t>
-      </w:r>
-      <w:r>
-        <w:rPr>
-          <w:sz w:val="24"/>
-          <w:szCs w:val="24"/>
-        </w:rPr>
-        <w:t xml:space="preserve"> </w:t>
-      </w:r>
-      <w:r>
-        <w:rPr>
-          <w:sz w:val="24"/>
-          <w:szCs w:val="24"/>
-        </w:rPr>
-        <w:t xml:space="preserve">gumb, ki v ozadju </w:t>
-      </w:r>
-      <w:r>
-        <w:rPr>
-          <w:sz w:val="24"/>
-          <w:szCs w:val="24"/>
-        </w:rPr>
-        <w:t>prikaže</w:t>
-      </w:r>
-      <w:r>
-        <w:rPr>
-          <w:sz w:val="24"/>
-          <w:szCs w:val="24"/>
-        </w:rPr>
-        <w:t xml:space="preserve"> naslovnico</w:t>
-      </w:r>
-    </w:p>
-    <w:p>
-      <w:pPr>
-        <w:pStyle w:val="Odstavekseznama"/>
-        <w:rPr>
-          <w:sz w:val="24"/>
-          <w:szCs w:val="24"/>
-        </w:rPr>
-      </w:pPr>
+        <w:t>Navodila za igro</w:t>
+      </w:r>
     </w:p>
     <w:p>
       <w:pPr>
@@ -5682,6 +5718,160 @@
           <w:szCs w:val="24"/>
         </w:rPr>
       </w:pPr>
+      <w:r>
+        <w:rPr>
+          <w:b/>
+          <w:bCs/>
+          <w:sz w:val="24"/>
+          <w:szCs w:val="24"/>
+        </w:rPr>
+        <w:t>Skupna statistika</w:t>
+      </w:r>
+      <w:r>
+        <w:rPr>
+          <w:sz w:val="24"/>
+          <w:szCs w:val="24"/>
+        </w:rPr>
+        <w:t xml:space="preserve"> </w:t>
+      </w:r>
+      <w:r>
+        <w:rPr>
+          <w:sz w:val="24"/>
+          <w:szCs w:val="24"/>
+        </w:rPr>
+        <w:t>–</w:t>
+      </w:r>
+      <w:r>
+        <w:rPr>
+          <w:b/>
+          <w:bCs/>
+          <w:sz w:val="24"/>
+          <w:szCs w:val="24"/>
+        </w:rPr>
+        <w:t xml:space="preserve"> </w:t>
+      </w:r>
+      <w:r>
+        <w:rPr>
+          <w:sz w:val="24"/>
+          <w:szCs w:val="24"/>
+        </w:rPr>
+        <w:t>skupno število doseženih točk, število odigranih iger, povprečje točk na igro</w:t>
+      </w:r>
+    </w:p>
+    <w:p>
+      <w:pPr>
+        <w:pStyle w:val="Odstavekseznama"/>
+        <w:numPr>
+          <w:ilvl w:val="0"/>
+          <w:numId w:val="44"/>
+        </w:numPr>
+        <w:rPr>
+          <w:sz w:val="24"/>
+          <w:szCs w:val="24"/>
+        </w:rPr>
+      </w:pPr>
+      <w:r>
+        <w:rPr>
+          <w:b/>
+          <w:bCs/>
+          <w:sz w:val="24"/>
+          <w:szCs w:val="24"/>
+        </w:rPr>
+        <w:t>Števec časa</w:t>
+      </w:r>
+      <w:r>
+        <w:rPr>
+          <w:sz w:val="24"/>
+          <w:szCs w:val="24"/>
+        </w:rPr>
+        <w:t xml:space="preserve"> - prikaz pretečenega časa v formatu MM:SS</w:t>
+      </w:r>
+    </w:p>
+    <w:p>
+      <w:pPr>
+        <w:pStyle w:val="Odstavekseznama"/>
+        <w:numPr>
+          <w:ilvl w:val="0"/>
+          <w:numId w:val="44"/>
+        </w:numPr>
+        <w:rPr>
+          <w:sz w:val="24"/>
+          <w:szCs w:val="24"/>
+        </w:rPr>
+      </w:pPr>
+      <w:r>
+        <w:rPr>
+          <w:b/>
+          <w:bCs/>
+          <w:sz w:val="24"/>
+          <w:szCs w:val="24"/>
+        </w:rPr>
+        <w:t>Prikaži rešitev</w:t>
+      </w:r>
+      <w:r>
+        <w:rPr>
+          <w:sz w:val="24"/>
+          <w:szCs w:val="24"/>
+        </w:rPr>
+        <w:t xml:space="preserve"> </w:t>
+      </w:r>
+      <w:r>
+        <w:rPr>
+          <w:sz w:val="24"/>
+          <w:szCs w:val="24"/>
+        </w:rPr>
+        <w:t>–</w:t>
+      </w:r>
+      <w:r>
+        <w:rPr>
+          <w:sz w:val="24"/>
+          <w:szCs w:val="24"/>
+        </w:rPr>
+        <w:t xml:space="preserve"> </w:t>
+      </w:r>
+      <w:r>
+        <w:rPr>
+          <w:sz w:val="24"/>
+          <w:szCs w:val="24"/>
+        </w:rPr>
+        <w:t xml:space="preserve">gumb, ki v ozadju </w:t>
+      </w:r>
+      <w:r>
+        <w:rPr>
+          <w:sz w:val="24"/>
+          <w:szCs w:val="24"/>
+        </w:rPr>
+        <w:t>prikaže</w:t>
+      </w:r>
+      <w:r>
+        <w:rPr>
+          <w:sz w:val="24"/>
+          <w:szCs w:val="24"/>
+        </w:rPr>
+        <w:t xml:space="preserve"> naslovnico</w:t>
+      </w:r>
+    </w:p>
+    <w:p>
+      <w:pPr>
+        <w:pStyle w:val="Odstavekseznama"/>
+        <w:rPr>
+          <w:sz w:val="24"/>
+          <w:szCs w:val="24"/>
+        </w:rPr>
+      </w:pPr>
+    </w:p>
+    <w:p>
+      <w:pPr>
+        <w:pStyle w:val="Odstavekseznama"/>
+        <w:numPr>
+          <w:ilvl w:val="0"/>
+          <w:numId w:val="44"/>
+        </w:numPr>
+        <w:rPr>
+          <w:sz w:val="24"/>
+          <w:szCs w:val="24"/>
+        </w:rPr>
+      </w:pPr>
       <w:proofErr w:type="spellStart"/>
       <w:r>
         <w:rPr>
@@ -5718,6 +5908,7 @@
           <w:sz w:val="24"/>
           <w:szCs w:val="24"/>
         </w:rPr>
+        <w:lastRenderedPageBreak/>
         <w:t>Posamezni kosi sestavljanke</w:t>
       </w:r>
     </w:p>
@@ -5856,9 +6047,8 @@
       <w:pPr>
         <w:pStyle w:val="Naslov2"/>
       </w:pPr>
-      <w:bookmarkStart w:id="10" w:name="_Toc199948517"/>
-      <w:r>
-        <w:lastRenderedPageBreak/>
+      <w:bookmarkStart w:id="10" w:name="_Toc200298682"/>
+      <w:r>
         <w:t>Zaslon z rezultati</w:t>
       </w:r>
       <w:bookmarkEnd w:id="10"/>
@@ -5913,33 +6103,8 @@
           <w:sz w:val="24"/>
           <w:szCs w:val="24"/>
         </w:rPr>
-        <w:t>Čestitke</w:t>
-      </w:r>
-      <w:r>
-        <w:rPr>
-          <w:b/>
-          <w:bCs/>
-          <w:sz w:val="24"/>
-          <w:szCs w:val="24"/>
-        </w:rPr>
-        <w:t>!</w:t>
-      </w:r>
-      <w:r>
-        <w:rPr>
-          <w:sz w:val="24"/>
-          <w:szCs w:val="24"/>
-        </w:rPr>
-        <w:t xml:space="preserve"> - obvestilo o uspešno sestavljeni sestavljanki</w:t>
-      </w:r>
-    </w:p>
-    <w:p>
-      <w:pPr>
-        <w:pStyle w:val="Odstavekseznama"/>
-        <w:rPr>
-          <w:sz w:val="24"/>
-          <w:szCs w:val="24"/>
-        </w:rPr>
-      </w:pPr>
+        <w:t>Naslov aplikacije</w:t>
+      </w:r>
     </w:p>
     <w:p>
       <w:pPr>
@@ -5960,6 +6125,127 @@
           <w:sz w:val="24"/>
           <w:szCs w:val="24"/>
         </w:rPr>
+        <w:t>Navodila za igro</w:t>
+      </w:r>
+    </w:p>
+    <w:p>
+      <w:pPr>
+        <w:pStyle w:val="Odstavekseznama"/>
+        <w:numPr>
+          <w:ilvl w:val="0"/>
+          <w:numId w:val="46"/>
+        </w:numPr>
+        <w:rPr>
+          <w:sz w:val="24"/>
+          <w:szCs w:val="24"/>
+        </w:rPr>
+      </w:pPr>
+      <w:r>
+        <w:rPr>
+          <w:b/>
+          <w:bCs/>
+          <w:sz w:val="24"/>
+          <w:szCs w:val="24"/>
+        </w:rPr>
+        <w:t>Skupna statistika</w:t>
+      </w:r>
+      <w:r>
+        <w:rPr>
+          <w:sz w:val="24"/>
+          <w:szCs w:val="24"/>
+        </w:rPr>
+        <w:t xml:space="preserve"> </w:t>
+      </w:r>
+      <w:r>
+        <w:rPr>
+          <w:sz w:val="24"/>
+          <w:szCs w:val="24"/>
+        </w:rPr>
+        <w:t>–</w:t>
+      </w:r>
+      <w:r>
+        <w:rPr>
+          <w:b/>
+          <w:bCs/>
+          <w:sz w:val="24"/>
+          <w:szCs w:val="24"/>
+        </w:rPr>
+        <w:t xml:space="preserve"> </w:t>
+      </w:r>
+      <w:r>
+        <w:rPr>
+          <w:sz w:val="24"/>
+          <w:szCs w:val="24"/>
+        </w:rPr>
+        <w:t>skupno število doseženih točk, število odigranih iger, povprečje točk na igro</w:t>
+      </w:r>
+    </w:p>
+    <w:p>
+      <w:pPr>
+        <w:pStyle w:val="Odstavekseznama"/>
+        <w:numPr>
+          <w:ilvl w:val="0"/>
+          <w:numId w:val="46"/>
+        </w:numPr>
+        <w:rPr>
+          <w:sz w:val="24"/>
+          <w:szCs w:val="24"/>
+        </w:rPr>
+      </w:pPr>
+      <w:r>
+        <w:rPr>
+          <w:b/>
+          <w:bCs/>
+          <w:sz w:val="24"/>
+          <w:szCs w:val="24"/>
+        </w:rPr>
+        <w:t>Čestitke</w:t>
+      </w:r>
+      <w:r>
+        <w:rPr>
+          <w:b/>
+          <w:bCs/>
+          <w:sz w:val="24"/>
+          <w:szCs w:val="24"/>
+        </w:rPr>
+        <w:t>!</w:t>
+      </w:r>
+      <w:r>
+        <w:rPr>
+          <w:sz w:val="24"/>
+          <w:szCs w:val="24"/>
+        </w:rPr>
+        <w:t xml:space="preserve"> - obvestilo o uspešno sestavljeni sestavljanki</w:t>
+      </w:r>
+    </w:p>
+    <w:p>
+      <w:pPr>
+        <w:pStyle w:val="Odstavekseznama"/>
+        <w:rPr>
+          <w:sz w:val="24"/>
+          <w:szCs w:val="24"/>
+        </w:rPr>
+      </w:pPr>
+    </w:p>
+    <w:p>
+      <w:pPr>
+        <w:pStyle w:val="Odstavekseznama"/>
+        <w:numPr>
+          <w:ilvl w:val="0"/>
+          <w:numId w:val="46"/>
+        </w:numPr>
+        <w:rPr>
+          <w:sz w:val="24"/>
+          <w:szCs w:val="24"/>
+        </w:rPr>
+      </w:pPr>
+      <w:r>
+        <w:rPr>
+          <w:b/>
+          <w:bCs/>
+          <w:sz w:val="24"/>
+          <w:szCs w:val="24"/>
+        </w:rPr>
         <w:t>Podrobnosti</w:t>
       </w:r>
       <w:r>
@@ -6200,6 +6486,36 @@
         </w:rPr>
         <w:t>Podatki o knjigi</w:t>
       </w:r>
+      <w:r>
+        <w:rPr>
+          <w:b/>
+          <w:bCs/>
+          <w:sz w:val="24"/>
+          <w:szCs w:val="24"/>
+        </w:rPr>
+        <w:t xml:space="preserve"> </w:t>
+      </w:r>
+      <w:r>
+        <w:rPr>
+          <w:sz w:val="24"/>
+          <w:szCs w:val="24"/>
+        </w:rPr>
+        <w:t>– naslov,</w:t>
+      </w:r>
+      <w:r>
+        <w:rPr>
+          <w:sz w:val="24"/>
+          <w:szCs w:val="24"/>
+        </w:rPr>
+        <w:t xml:space="preserve"> </w:t>
+      </w:r>
+      <w:r>
+        <w:rPr>
+          <w:sz w:val="24"/>
+          <w:szCs w:val="24"/>
+        </w:rPr>
+        <w:t>avtor</w:t>
+      </w:r>
     </w:p>
     <w:p>
       <w:pPr>
@@ -6249,6 +6565,402 @@
           <w:szCs w:val="24"/>
         </w:rPr>
         <w:t>vrne na začetni zaslon</w:t>
+      </w:r>
+    </w:p>
+    <w:p/>
+    <w:p/>
+    <w:p/>
+    <w:p/>
+    <w:p/>
+    <w:p/>
+    <w:p/>
+    <w:p/>
+    <w:p/>
+    <w:p>
+      <w:pPr>
+        <w:pStyle w:val="Naslov1"/>
+      </w:pPr>
+      <w:bookmarkStart w:id="11" w:name="_Toc200298683"/>
+      <w:r>
+        <w:lastRenderedPageBreak/>
+        <w:t>Struktura rešitve</w:t>
+      </w:r>
+      <w:bookmarkEnd w:id="11"/>
+    </w:p>
+    <w:p/>
+    <w:p>
+      <w:proofErr w:type="spellStart"/>
+      <w:r>
+        <w:t>puzzle</w:t>
+      </w:r>
+      <w:proofErr w:type="spellEnd"/>
+      <w:r>
+        <w:t>-game/</w:t>
+      </w:r>
+    </w:p>
+    <w:p>
+      <w:r>
+        <w:rPr>
+          <w:rFonts w:ascii="MS Gothic" w:eastAsia="MS Gothic" w:hAnsi="MS Gothic" w:cs="MS Gothic" w:hint="eastAsia"/>
+        </w:rPr>
+        <w:t>├</w:t>
+      </w:r>
+      <w:r>
+        <w:rPr>
+          <w:rFonts w:ascii="Aptos" w:hAnsi="Aptos" w:cs="Aptos"/>
+        </w:rPr>
+        <w:t>──</w:t>
+      </w:r>
+      <w:r>
+        <w:t xml:space="preserve"> src/</w:t>
+      </w:r>
+    </w:p>
+    <w:p>
+      <w:r>
+        <w:t xml:space="preserve">│   </w:t>
+      </w:r>
+      <w:r>
+        <w:rPr>
+          <w:rFonts w:ascii="MS Gothic" w:eastAsia="MS Gothic" w:hAnsi="MS Gothic" w:cs="MS Gothic" w:hint="eastAsia"/>
+        </w:rPr>
+        <w:t>├</w:t>
+      </w:r>
+      <w:r>
+        <w:rPr>
+          <w:rFonts w:ascii="Aptos" w:hAnsi="Aptos" w:cs="Aptos"/>
+        </w:rPr>
+        <w:t>──</w:t>
+      </w:r>
+      <w:r>
+        <w:t xml:space="preserve"> </w:t>
+      </w:r>
+      <w:proofErr w:type="spellStart"/>
+      <w:r>
+        <w:t>app</w:t>
+      </w:r>
+      <w:proofErr w:type="spellEnd"/>
+      <w:r>
+        <w:t>/                 # Next.js aplikacija</w:t>
+      </w:r>
+    </w:p>
+    <w:p>
+      <w:r>
+        <w:t xml:space="preserve">│   │   </w:t>
+      </w:r>
+      <w:r>
+        <w:rPr>
+          <w:rFonts w:ascii="MS Gothic" w:eastAsia="MS Gothic" w:hAnsi="MS Gothic" w:cs="MS Gothic" w:hint="eastAsia"/>
+        </w:rPr>
+        <w:t>├</w:t>
+      </w:r>
+      <w:r>
+        <w:rPr>
+          <w:rFonts w:ascii="Aptos" w:hAnsi="Aptos" w:cs="Aptos"/>
+        </w:rPr>
+        <w:t>──</w:t>
+      </w:r>
+      <w:r>
+        <w:t xml:space="preserve"> </w:t>
+      </w:r>
+      <w:proofErr w:type="spellStart"/>
+      <w:r>
+        <w:t>api</w:t>
+      </w:r>
+      <w:proofErr w:type="spellEnd"/>
+      <w:r>
+        <w:t>/             # API kon</w:t>
+      </w:r>
+      <w:r>
+        <w:rPr>
+          <w:rFonts w:ascii="Aptos" w:hAnsi="Aptos" w:cs="Aptos"/>
+        </w:rPr>
+        <w:t>č</w:t>
+      </w:r>
+      <w:r>
+        <w:t>ne to</w:t>
+      </w:r>
+      <w:r>
+        <w:rPr>
+          <w:rFonts w:ascii="Aptos" w:hAnsi="Aptos" w:cs="Aptos"/>
+        </w:rPr>
+        <w:t>č</w:t>
+      </w:r>
+      <w:r>
+        <w:t>ke</w:t>
+      </w:r>
+    </w:p>
+    <w:p>
+      <w:r>
+        <w:t xml:space="preserve">│   │   └── </w:t>
+      </w:r>
+      <w:proofErr w:type="spellStart"/>
+      <w:r>
+        <w:t>page.tsx</w:t>
+      </w:r>
+      <w:proofErr w:type="spellEnd"/>
+      <w:r>
+        <w:t xml:space="preserve">         # Glavna stran</w:t>
+      </w:r>
+    </w:p>
+    <w:p>
+      <w:r>
+        <w:t xml:space="preserve">│   </w:t>
+      </w:r>
+      <w:r>
+        <w:rPr>
+          <w:rFonts w:ascii="MS Gothic" w:eastAsia="MS Gothic" w:hAnsi="MS Gothic" w:cs="MS Gothic" w:hint="eastAsia"/>
+        </w:rPr>
+        <w:t>├</w:t>
+      </w:r>
+      <w:r>
+        <w:rPr>
+          <w:rFonts w:ascii="Aptos" w:hAnsi="Aptos" w:cs="Aptos"/>
+        </w:rPr>
+        <w:t>──</w:t>
+      </w:r>
+      <w:r>
+        <w:t xml:space="preserve"> </w:t>
+      </w:r>
+      <w:proofErr w:type="spellStart"/>
+      <w:r>
+        <w:t>components</w:t>
+      </w:r>
+      <w:proofErr w:type="spellEnd"/>
+      <w:r>
+        <w:t xml:space="preserve">/          # </w:t>
+      </w:r>
+      <w:proofErr w:type="spellStart"/>
+      <w:r>
+        <w:t>React</w:t>
+      </w:r>
+      <w:proofErr w:type="spellEnd"/>
+      <w:r>
+        <w:t xml:space="preserve"> komponente</w:t>
+      </w:r>
+    </w:p>
+    <w:p>
+      <w:r>
+        <w:t xml:space="preserve">│   │   </w:t>
+      </w:r>
+      <w:r>
+        <w:rPr>
+          <w:rFonts w:ascii="MS Gothic" w:eastAsia="MS Gothic" w:hAnsi="MS Gothic" w:cs="MS Gothic" w:hint="eastAsia"/>
+        </w:rPr>
+        <w:t>├</w:t>
+      </w:r>
+      <w:r>
+        <w:rPr>
+          <w:rFonts w:ascii="Aptos" w:hAnsi="Aptos" w:cs="Aptos"/>
+        </w:rPr>
+        <w:t>──</w:t>
+      </w:r>
+      <w:r>
+        <w:t xml:space="preserve"> </w:t>
+      </w:r>
+      <w:proofErr w:type="spellStart"/>
+      <w:r>
+        <w:t>PuzzleGame.tsx</w:t>
+      </w:r>
+      <w:proofErr w:type="spellEnd"/>
+      <w:r>
+        <w:t xml:space="preserve">   # Glavna logika igre</w:t>
+      </w:r>
+    </w:p>
+    <w:p>
+      <w:r>
+        <w:t xml:space="preserve">│   │   </w:t>
+      </w:r>
+      <w:r>
+        <w:rPr>
+          <w:rFonts w:ascii="MS Gothic" w:eastAsia="MS Gothic" w:hAnsi="MS Gothic" w:cs="MS Gothic" w:hint="eastAsia"/>
+        </w:rPr>
+        <w:t>├</w:t>
+      </w:r>
+      <w:r>
+        <w:rPr>
+          <w:rFonts w:ascii="Aptos" w:hAnsi="Aptos" w:cs="Aptos"/>
+        </w:rPr>
+        <w:t>──</w:t>
+      </w:r>
+      <w:r>
+        <w:t xml:space="preserve"> </w:t>
+      </w:r>
+      <w:proofErr w:type="spellStart"/>
+      <w:r>
+        <w:t>Timer.tsx</w:t>
+      </w:r>
+      <w:proofErr w:type="spellEnd"/>
+      <w:r>
+        <w:t xml:space="preserve">        # Komponenta za merjenje </w:t>
+      </w:r>
+      <w:r>
+        <w:rPr>
+          <w:rFonts w:ascii="Aptos" w:hAnsi="Aptos" w:cs="Aptos"/>
+        </w:rPr>
+        <w:t>č</w:t>
+      </w:r>
+      <w:r>
+        <w:t>asa</w:t>
+      </w:r>
+    </w:p>
+    <w:p>
+      <w:r>
+        <w:t>│   │   └── ...</w:t>
+      </w:r>
+    </w:p>
+    <w:p>
+      <w:r>
+        <w:t xml:space="preserve">│   </w:t>
+      </w:r>
+      <w:r>
+        <w:rPr>
+          <w:rFonts w:ascii="MS Gothic" w:eastAsia="MS Gothic" w:hAnsi="MS Gothic" w:cs="MS Gothic" w:hint="eastAsia"/>
+        </w:rPr>
+        <w:t>├</w:t>
+      </w:r>
+      <w:r>
+        <w:rPr>
+          <w:rFonts w:ascii="Aptos" w:hAnsi="Aptos" w:cs="Aptos"/>
+        </w:rPr>
+        <w:t>──</w:t>
+      </w:r>
+      <w:r>
+        <w:t xml:space="preserve"> lib/                 # Pomo</w:t>
+      </w:r>
+      <w:r>
+        <w:rPr>
+          <w:rFonts w:ascii="Aptos" w:hAnsi="Aptos" w:cs="Aptos"/>
+        </w:rPr>
+        <w:t>ž</w:t>
+      </w:r>
+      <w:r>
+        <w:t>ne funkcije</w:t>
+      </w:r>
+    </w:p>
+    <w:p>
+      <w:r>
+        <w:t xml:space="preserve">│   </w:t>
+      </w:r>
+      <w:r>
+        <w:rPr>
+          <w:rFonts w:ascii="MS Gothic" w:eastAsia="MS Gothic" w:hAnsi="MS Gothic" w:cs="MS Gothic" w:hint="eastAsia"/>
+        </w:rPr>
+        <w:t>├</w:t>
+      </w:r>
+      <w:r>
+        <w:rPr>
+          <w:rFonts w:ascii="Aptos" w:hAnsi="Aptos" w:cs="Aptos"/>
+        </w:rPr>
+        <w:t>──</w:t>
+      </w:r>
+      <w:r>
+        <w:t xml:space="preserve"> </w:t>
+      </w:r>
+      <w:proofErr w:type="spellStart"/>
+      <w:r>
+        <w:t>types</w:t>
+      </w:r>
+      <w:proofErr w:type="spellEnd"/>
+      <w:r>
+        <w:t xml:space="preserve">/               # </w:t>
+      </w:r>
+      <w:proofErr w:type="spellStart"/>
+      <w:r>
+        <w:t>TypeScript</w:t>
+      </w:r>
+      <w:proofErr w:type="spellEnd"/>
+      <w:r>
+        <w:t xml:space="preserve"> tipi</w:t>
+      </w:r>
+    </w:p>
+    <w:p>
+      <w:r>
+        <w:t xml:space="preserve">│   └── </w:t>
+      </w:r>
+      <w:proofErr w:type="spellStart"/>
+      <w:r>
+        <w:t>utils</w:t>
+      </w:r>
+      <w:proofErr w:type="spellEnd"/>
+      <w:r>
+        <w:t>/               # Pomožne funkcije</w:t>
+      </w:r>
+    </w:p>
+    <w:p>
+      <w:r>
+        <w:rPr>
+          <w:rFonts w:ascii="MS Gothic" w:eastAsia="MS Gothic" w:hAnsi="MS Gothic" w:cs="MS Gothic" w:hint="eastAsia"/>
+        </w:rPr>
+        <w:t>├</w:t>
+      </w:r>
+      <w:r>
+        <w:rPr>
+          <w:rFonts w:ascii="Aptos" w:hAnsi="Aptos" w:cs="Aptos"/>
+        </w:rPr>
+        <w:t>──</w:t>
+      </w:r>
+      <w:r>
+        <w:t xml:space="preserve"> </w:t>
+      </w:r>
+      <w:proofErr w:type="spellStart"/>
+      <w:r>
+        <w:t>public</w:t>
+      </w:r>
+      <w:proofErr w:type="spellEnd"/>
+      <w:r>
+        <w:t>/                 # Stati</w:t>
+      </w:r>
+      <w:r>
+        <w:rPr>
+          <w:rFonts w:ascii="Aptos" w:hAnsi="Aptos" w:cs="Aptos"/>
+        </w:rPr>
+        <w:t>č</w:t>
+      </w:r>
+      <w:r>
+        <w:t>ne datoteke</w:t>
+      </w:r>
+    </w:p>
+    <w:p>
+      <w:r>
+        <w:rPr>
+          <w:rFonts w:ascii="MS Gothic" w:eastAsia="MS Gothic" w:hAnsi="MS Gothic" w:cs="MS Gothic" w:hint="eastAsia"/>
+        </w:rPr>
+        <w:t>├</w:t>
+      </w:r>
+      <w:r>
+        <w:rPr>
+          <w:rFonts w:ascii="Aptos" w:hAnsi="Aptos" w:cs="Aptos"/>
+        </w:rPr>
+        <w:t>──</w:t>
+      </w:r>
+      <w:r>
+        <w:t xml:space="preserve"> </w:t>
+      </w:r>
+      <w:proofErr w:type="spellStart"/>
+      <w:r>
+        <w:t>db</w:t>
+      </w:r>
+      <w:proofErr w:type="spellEnd"/>
+      <w:r>
+        <w:t>/</w:t>
+      </w:r>
+    </w:p>
+    <w:p>
+      <w:r>
+        <w:t xml:space="preserve">│   └── firebase_client.js  # </w:t>
+      </w:r>
+      <w:proofErr w:type="spellStart"/>
+      <w:r>
+        <w:t>Firebase</w:t>
+      </w:r>
+      <w:proofErr w:type="spellEnd"/>
+      <w:r>
+        <w:t xml:space="preserve"> konfiguracija</w:t>
+      </w:r>
+    </w:p>
+    <w:p>
+      <w:r>
+        <w:t>└── ...</w:t>
       </w:r>
     </w:p>
     <w:p/>
@@ -6263,415 +6975,11 @@
     <w:p/>
     <w:p/>
     <w:p/>
-    <w:p/>
-    <w:p/>
-    <w:p/>
-    <w:p/>
-    <w:p/>
     <w:p>
       <w:pPr>
         <w:pStyle w:val="Naslov1"/>
       </w:pPr>
-      <w:bookmarkStart w:id="11" w:name="_Toc199948518"/>
-      <w:r>
-        <w:lastRenderedPageBreak/>
-        <w:t>Struktura rešitve</w:t>
-      </w:r>
-      <w:bookmarkEnd w:id="11"/>
-    </w:p>
-    <w:p/>
-    <w:p>
-      <w:proofErr w:type="spellStart"/>
-      <w:r>
-        <w:t>puzzle</w:t>
-      </w:r>
-      <w:proofErr w:type="spellEnd"/>
-      <w:r>
-        <w:t>-game/</w:t>
-      </w:r>
-    </w:p>
-    <w:p>
-      <w:r>
-        <w:rPr>
-          <w:rFonts w:ascii="MS Gothic" w:eastAsia="MS Gothic" w:hAnsi="MS Gothic" w:cs="MS Gothic" w:hint="eastAsia"/>
-        </w:rPr>
-        <w:t>├</w:t>
-      </w:r>
-      <w:r>
-        <w:rPr>
-          <w:rFonts w:ascii="Aptos" w:hAnsi="Aptos" w:cs="Aptos"/>
-        </w:rPr>
-        <w:t>──</w:t>
-      </w:r>
-      <w:r>
-        <w:t xml:space="preserve"> src/</w:t>
-      </w:r>
-    </w:p>
-    <w:p>
-      <w:r>
-        <w:t xml:space="preserve">│   </w:t>
-      </w:r>
-      <w:r>
-        <w:rPr>
-          <w:rFonts w:ascii="MS Gothic" w:eastAsia="MS Gothic" w:hAnsi="MS Gothic" w:cs="MS Gothic" w:hint="eastAsia"/>
-        </w:rPr>
-        <w:t>├</w:t>
-      </w:r>
-      <w:r>
-        <w:rPr>
-          <w:rFonts w:ascii="Aptos" w:hAnsi="Aptos" w:cs="Aptos"/>
-        </w:rPr>
-        <w:t>──</w:t>
-      </w:r>
-      <w:r>
-        <w:t xml:space="preserve"> </w:t>
-      </w:r>
-      <w:proofErr w:type="spellStart"/>
-      <w:r>
-        <w:t>app</w:t>
-      </w:r>
-      <w:proofErr w:type="spellEnd"/>
-      <w:r>
-        <w:t>/                 # Next.js aplikacija</w:t>
-      </w:r>
-    </w:p>
-    <w:p>
-      <w:r>
-        <w:t xml:space="preserve">│   │   </w:t>
-      </w:r>
-      <w:r>
-        <w:rPr>
-          <w:rFonts w:ascii="MS Gothic" w:eastAsia="MS Gothic" w:hAnsi="MS Gothic" w:cs="MS Gothic" w:hint="eastAsia"/>
-        </w:rPr>
-        <w:t>├</w:t>
-      </w:r>
-      <w:r>
-        <w:rPr>
-          <w:rFonts w:ascii="Aptos" w:hAnsi="Aptos" w:cs="Aptos"/>
-        </w:rPr>
-        <w:t>──</w:t>
-      </w:r>
-      <w:r>
-        <w:t xml:space="preserve"> </w:t>
-      </w:r>
-      <w:proofErr w:type="spellStart"/>
-      <w:r>
-        <w:t>api</w:t>
-      </w:r>
-      <w:proofErr w:type="spellEnd"/>
-      <w:r>
-        <w:t>/             # API kon</w:t>
-      </w:r>
-      <w:r>
-        <w:rPr>
-          <w:rFonts w:ascii="Aptos" w:hAnsi="Aptos" w:cs="Aptos"/>
-        </w:rPr>
-        <w:t>č</w:t>
-      </w:r>
-      <w:r>
-        <w:t>ne to</w:t>
-      </w:r>
-      <w:r>
-        <w:rPr>
-          <w:rFonts w:ascii="Aptos" w:hAnsi="Aptos" w:cs="Aptos"/>
-        </w:rPr>
-        <w:t>č</w:t>
-      </w:r>
-      <w:r>
-        <w:t>ke</w:t>
-      </w:r>
-    </w:p>
-    <w:p>
-      <w:r>
-        <w:t xml:space="preserve">│   │   └── </w:t>
-      </w:r>
-      <w:proofErr w:type="spellStart"/>
-      <w:r>
-        <w:t>page.tsx</w:t>
-      </w:r>
-      <w:proofErr w:type="spellEnd"/>
-      <w:r>
-        <w:t xml:space="preserve">         # Glavna stran</w:t>
-      </w:r>
-    </w:p>
-    <w:p>
-      <w:r>
-        <w:t xml:space="preserve">│   </w:t>
-      </w:r>
-      <w:r>
-        <w:rPr>
-          <w:rFonts w:ascii="MS Gothic" w:eastAsia="MS Gothic" w:hAnsi="MS Gothic" w:cs="MS Gothic" w:hint="eastAsia"/>
-        </w:rPr>
-        <w:t>├</w:t>
-      </w:r>
-      <w:r>
-        <w:rPr>
-          <w:rFonts w:ascii="Aptos" w:hAnsi="Aptos" w:cs="Aptos"/>
-        </w:rPr>
-        <w:t>──</w:t>
-      </w:r>
-      <w:r>
-        <w:t xml:space="preserve"> </w:t>
-      </w:r>
-      <w:proofErr w:type="spellStart"/>
-      <w:r>
-        <w:t>components</w:t>
-      </w:r>
-      <w:proofErr w:type="spellEnd"/>
-      <w:r>
-        <w:t xml:space="preserve">/          # </w:t>
-      </w:r>
-      <w:proofErr w:type="spellStart"/>
-      <w:r>
-        <w:t>React</w:t>
-      </w:r>
-      <w:proofErr w:type="spellEnd"/>
-      <w:r>
-        <w:t xml:space="preserve"> komponente</w:t>
-      </w:r>
-    </w:p>
-    <w:p>
-      <w:r>
-        <w:t xml:space="preserve">│   │   </w:t>
-      </w:r>
-      <w:r>
-        <w:rPr>
-          <w:rFonts w:ascii="MS Gothic" w:eastAsia="MS Gothic" w:hAnsi="MS Gothic" w:cs="MS Gothic" w:hint="eastAsia"/>
-        </w:rPr>
-        <w:t>├</w:t>
-      </w:r>
-      <w:r>
-        <w:rPr>
-          <w:rFonts w:ascii="Aptos" w:hAnsi="Aptos" w:cs="Aptos"/>
-        </w:rPr>
-        <w:t>──</w:t>
-      </w:r>
-      <w:r>
-        <w:t xml:space="preserve"> </w:t>
-      </w:r>
-      <w:proofErr w:type="spellStart"/>
-      <w:r>
-        <w:t>PuzzleGame.tsx</w:t>
-      </w:r>
-      <w:proofErr w:type="spellEnd"/>
-      <w:r>
-        <w:t xml:space="preserve">   # Glavna logika igre</w:t>
-      </w:r>
-    </w:p>
-    <w:p>
-      <w:r>
-        <w:t xml:space="preserve">│   │   </w:t>
-      </w:r>
-      <w:r>
-        <w:rPr>
-          <w:rFonts w:ascii="MS Gothic" w:eastAsia="MS Gothic" w:hAnsi="MS Gothic" w:cs="MS Gothic" w:hint="eastAsia"/>
-        </w:rPr>
-        <w:t>├</w:t>
-      </w:r>
-      <w:r>
-        <w:rPr>
-          <w:rFonts w:ascii="Aptos" w:hAnsi="Aptos" w:cs="Aptos"/>
-        </w:rPr>
-        <w:t>──</w:t>
-      </w:r>
-      <w:r>
-        <w:t xml:space="preserve"> </w:t>
-      </w:r>
-      <w:proofErr w:type="spellStart"/>
-      <w:r>
-        <w:t>Timer.tsx</w:t>
-      </w:r>
-      <w:proofErr w:type="spellEnd"/>
-      <w:r>
-        <w:t xml:space="preserve">        # Komponenta za merjenje </w:t>
-      </w:r>
-      <w:r>
-        <w:rPr>
-          <w:rFonts w:ascii="Aptos" w:hAnsi="Aptos" w:cs="Aptos"/>
-        </w:rPr>
-        <w:t>č</w:t>
-      </w:r>
-      <w:r>
-        <w:t>asa</w:t>
-      </w:r>
-    </w:p>
-    <w:p>
-      <w:r>
-        <w:t>│   │   └── ...</w:t>
-      </w:r>
-    </w:p>
-    <w:p>
-      <w:r>
-        <w:t xml:space="preserve">│   </w:t>
-      </w:r>
-      <w:r>
-        <w:rPr>
-          <w:rFonts w:ascii="MS Gothic" w:eastAsia="MS Gothic" w:hAnsi="MS Gothic" w:cs="MS Gothic" w:hint="eastAsia"/>
-        </w:rPr>
-        <w:t>├</w:t>
-      </w:r>
-      <w:r>
-        <w:rPr>
-          <w:rFonts w:ascii="Aptos" w:hAnsi="Aptos" w:cs="Aptos"/>
-        </w:rPr>
-        <w:t>──</w:t>
-      </w:r>
-      <w:r>
-        <w:t xml:space="preserve"> lib/                 # Pomo</w:t>
-      </w:r>
-      <w:r>
-        <w:rPr>
-          <w:rFonts w:ascii="Aptos" w:hAnsi="Aptos" w:cs="Aptos"/>
-        </w:rPr>
-        <w:t>ž</w:t>
-      </w:r>
-      <w:r>
-        <w:t>ne funkcije</w:t>
-      </w:r>
-    </w:p>
-    <w:p>
-      <w:r>
-        <w:t xml:space="preserve">│   </w:t>
-      </w:r>
-      <w:r>
-        <w:rPr>
-          <w:rFonts w:ascii="MS Gothic" w:eastAsia="MS Gothic" w:hAnsi="MS Gothic" w:cs="MS Gothic" w:hint="eastAsia"/>
-        </w:rPr>
-        <w:t>├</w:t>
-      </w:r>
-      <w:r>
-        <w:rPr>
-          <w:rFonts w:ascii="Aptos" w:hAnsi="Aptos" w:cs="Aptos"/>
-        </w:rPr>
-        <w:t>──</w:t>
-      </w:r>
-      <w:r>
-        <w:t xml:space="preserve"> </w:t>
-      </w:r>
-      <w:proofErr w:type="spellStart"/>
-      <w:r>
-        <w:t>types</w:t>
-      </w:r>
-      <w:proofErr w:type="spellEnd"/>
-      <w:r>
-        <w:t xml:space="preserve">/               # </w:t>
-      </w:r>
-      <w:proofErr w:type="spellStart"/>
-      <w:r>
-        <w:t>TypeScript</w:t>
-      </w:r>
-      <w:proofErr w:type="spellEnd"/>
-      <w:r>
-        <w:t xml:space="preserve"> tipi</w:t>
-      </w:r>
-    </w:p>
-    <w:p>
-      <w:r>
-        <w:t xml:space="preserve">│   └── </w:t>
-      </w:r>
-      <w:proofErr w:type="spellStart"/>
-      <w:r>
-        <w:t>utils</w:t>
-      </w:r>
-      <w:proofErr w:type="spellEnd"/>
-      <w:r>
-        <w:t>/               # Pomožne funkcije</w:t>
-      </w:r>
-    </w:p>
-    <w:p>
-      <w:r>
-        <w:rPr>
-          <w:rFonts w:ascii="MS Gothic" w:eastAsia="MS Gothic" w:hAnsi="MS Gothic" w:cs="MS Gothic" w:hint="eastAsia"/>
-        </w:rPr>
-        <w:t>├</w:t>
-      </w:r>
-      <w:r>
-        <w:rPr>
-          <w:rFonts w:ascii="Aptos" w:hAnsi="Aptos" w:cs="Aptos"/>
-        </w:rPr>
-        <w:t>──</w:t>
-      </w:r>
-      <w:r>
-        <w:t xml:space="preserve"> </w:t>
-      </w:r>
-      <w:proofErr w:type="spellStart"/>
-      <w:r>
-        <w:t>public</w:t>
-      </w:r>
-      <w:proofErr w:type="spellEnd"/>
-      <w:r>
-        <w:t>/                 # Stati</w:t>
-      </w:r>
-      <w:r>
-        <w:rPr>
-          <w:rFonts w:ascii="Aptos" w:hAnsi="Aptos" w:cs="Aptos"/>
-        </w:rPr>
-        <w:t>č</w:t>
-      </w:r>
-      <w:r>
-        <w:t>ne datoteke</w:t>
-      </w:r>
-    </w:p>
-    <w:p>
-      <w:r>
-        <w:rPr>
-          <w:rFonts w:ascii="MS Gothic" w:eastAsia="MS Gothic" w:hAnsi="MS Gothic" w:cs="MS Gothic" w:hint="eastAsia"/>
-        </w:rPr>
-        <w:t>├</w:t>
-      </w:r>
-      <w:r>
-        <w:rPr>
-          <w:rFonts w:ascii="Aptos" w:hAnsi="Aptos" w:cs="Aptos"/>
-        </w:rPr>
-        <w:t>──</w:t>
-      </w:r>
-      <w:r>
-        <w:t xml:space="preserve"> </w:t>
-      </w:r>
-      <w:proofErr w:type="spellStart"/>
-      <w:r>
-        <w:t>db</w:t>
-      </w:r>
-      <w:proofErr w:type="spellEnd"/>
-      <w:r>
-        <w:t>/</w:t>
-      </w:r>
-    </w:p>
-    <w:p>
-      <w:r>
-        <w:t xml:space="preserve">│   └── firebase_client.js  # </w:t>
-      </w:r>
-      <w:proofErr w:type="spellStart"/>
-      <w:r>
-        <w:t>Firebase</w:t>
-      </w:r>
-      <w:proofErr w:type="spellEnd"/>
-      <w:r>
-        <w:t xml:space="preserve"> konfiguracija</w:t>
-      </w:r>
-    </w:p>
-    <w:p>
-      <w:r>
-        <w:t>└── ...</w:t>
-      </w:r>
-    </w:p>
-    <w:p/>
-    <w:p/>
-    <w:p/>
-    <w:p/>
-    <w:p/>
-    <w:p/>
-    <w:p/>
-    <w:p/>
-    <w:p/>
-    <w:p/>
-    <w:p/>
-    <w:p/>
-    <w:p>
-      <w:pPr>
-        <w:pStyle w:val="Naslov1"/>
-      </w:pPr>
-      <w:bookmarkStart w:id="12" w:name="_Toc199948519"/>
+      <w:bookmarkStart w:id="12" w:name="_Toc200298684"/>
       <w:r>
         <w:lastRenderedPageBreak/>
         <w:t>Zunanje odvisnosti aplikacije</w:t>
@@ -7443,7 +7751,7 @@
       <w:pPr>
         <w:pStyle w:val="Naslov1"/>
       </w:pPr>
-      <w:bookmarkStart w:id="13" w:name="_Toc199948520"/>
+      <w:bookmarkStart w:id="13" w:name="_Toc200298685"/>
       <w:r>
         <w:lastRenderedPageBreak/>
         <w:t>Navodila za zagon</w:t>
@@ -8457,7 +8765,7 @@
       <w:pPr>
         <w:pStyle w:val="Naslov1"/>
       </w:pPr>
-      <w:bookmarkStart w:id="14" w:name="_Toc199948521"/>
+      <w:bookmarkStart w:id="14" w:name="_Toc200298686"/>
       <w:r>
         <w:lastRenderedPageBreak/>
         <w:t>Navodila za nadaljnji razvoj</w:t>
@@ -8938,7 +9246,7 @@
       <w:pPr>
         <w:pStyle w:val="Naslov1"/>
       </w:pPr>
-      <w:bookmarkStart w:id="15" w:name="_Toc199948522"/>
+      <w:bookmarkStart w:id="15" w:name="_Toc200298687"/>
       <w:r>
         <w:lastRenderedPageBreak/>
         <w:t>Odprte pomanjkljivosti in napake</w:t>
@@ -9257,7 +9565,7 @@
       <w:pPr>
         <w:pStyle w:val="Naslov1"/>
       </w:pPr>
-      <w:bookmarkStart w:id="16" w:name="_Toc199948523"/>
+      <w:bookmarkStart w:id="16" w:name="_Toc200298688"/>
       <w:r>
         <w:lastRenderedPageBreak/>
         <w:t>Prevzem rešitve</w:t>

</xml_diff>

<commit_message>
Sign Out BUG FIX
</commit_message>
<xml_diff>
--- a/docs/dokumentacija.docx
+++ b/docs/dokumentacija.docx
@@ -242,7 +242,7 @@
           <w:sz w:val="28"/>
           <w:szCs w:val="28"/>
         </w:rPr>
-        <w:t xml:space="preserve">Avtorji: Matija Čoh, Aleš Fon Cafnik, Miha </w:t>
+        <w:t xml:space="preserve">Avtorji: Matija Čoh, Aleš Fon </w:t>
       </w:r>
       <w:proofErr w:type="spellStart"/>
       <w:r>
@@ -250,16 +250,30 @@
           <w:sz w:val="28"/>
           <w:szCs w:val="28"/>
         </w:rPr>
-        <w:t>G</w:t>
-      </w:r>
+        <w:t>Cafnik</w:t>
+      </w:r>
+      <w:proofErr w:type="spellEnd"/>
       <w:r>
         <w:rPr>
           <w:sz w:val="28"/>
           <w:szCs w:val="28"/>
         </w:rPr>
+        <w:t xml:space="preserve">, Miha </w:t>
+      </w:r>
+      <w:r>
+        <w:rPr>
+          <w:sz w:val="28"/>
+          <w:szCs w:val="28"/>
+        </w:rPr>
+        <w:t>G</w:t>
+      </w:r>
+      <w:r>
+        <w:rPr>
+          <w:sz w:val="28"/>
+          <w:szCs w:val="28"/>
+        </w:rPr>
         <w:t>ovedič</w:t>
       </w:r>
-      <w:proofErr w:type="spellEnd"/>
     </w:p>
     <w:p>
       <w:pPr>
@@ -304,7 +318,7 @@
       <w:sdtContent>
         <w:p>
           <w:pPr>
-            <w:pStyle w:val="NaslovTOC"/>
+            <w:pStyle w:val="TOCHeading"/>
           </w:pPr>
           <w:r>
             <w:t>Vsebina</w:t>
@@ -322,7 +336,7 @@
         </w:p>
         <w:p>
           <w:pPr>
-            <w:pStyle w:val="Kazalovsebine1"/>
+            <w:pStyle w:val="TOC1"/>
             <w:tabs>
               <w:tab w:val="right" w:leader="dot" w:pos="9062"/>
             </w:tabs>
@@ -346,7 +360,7 @@
           <w:hyperlink w:anchor="_Toc200298672" w:history="1">
             <w:r>
               <w:rPr>
-                <w:rStyle w:val="Hiperpovezava"/>
+                <w:rStyle w:val="Hyperlink"/>
                 <w:noProof/>
               </w:rPr>
               <w:t>Opis funkcionalnosti rešitve Igrifikacija</w:t>
@@ -403,7 +417,7 @@
         </w:p>
         <w:p>
           <w:pPr>
-            <w:pStyle w:val="Kazalovsebine1"/>
+            <w:pStyle w:val="TOC1"/>
             <w:tabs>
               <w:tab w:val="right" w:leader="dot" w:pos="9062"/>
             </w:tabs>
@@ -418,7 +432,7 @@
           <w:hyperlink w:anchor="_Toc200298673" w:history="1">
             <w:r>
               <w:rPr>
-                <w:rStyle w:val="Hiperpovezava"/>
+                <w:rStyle w:val="Hyperlink"/>
                 <w:noProof/>
               </w:rPr>
               <w:t>Arhitektura in komponente rešitve</w:t>
@@ -475,7 +489,7 @@
         </w:p>
         <w:p>
           <w:pPr>
-            <w:pStyle w:val="Kazalovsebine2"/>
+            <w:pStyle w:val="TOC2"/>
             <w:tabs>
               <w:tab w:val="right" w:leader="dot" w:pos="9062"/>
             </w:tabs>
@@ -490,7 +504,7 @@
           <w:hyperlink w:anchor="_Toc200298674" w:history="1">
             <w:r>
               <w:rPr>
-                <w:rStyle w:val="Hiperpovezava"/>
+                <w:rStyle w:val="Hyperlink"/>
                 <w:noProof/>
               </w:rPr>
               <w:t>Uporabljene tehnologije</w:t>
@@ -547,7 +561,7 @@
         </w:p>
         <w:p>
           <w:pPr>
-            <w:pStyle w:val="Kazalovsebine2"/>
+            <w:pStyle w:val="TOC2"/>
             <w:tabs>
               <w:tab w:val="right" w:leader="dot" w:pos="9062"/>
             </w:tabs>
@@ -562,7 +576,7 @@
           <w:hyperlink w:anchor="_Toc200298675" w:history="1">
             <w:r>
               <w:rPr>
-                <w:rStyle w:val="Hiperpovezava"/>
+                <w:rStyle w:val="Hyperlink"/>
                 <w:noProof/>
               </w:rPr>
               <w:t>Glavne komponente</w:t>
@@ -619,7 +633,7 @@
         </w:p>
         <w:p>
           <w:pPr>
-            <w:pStyle w:val="Kazalovsebine1"/>
+            <w:pStyle w:val="TOC1"/>
             <w:tabs>
               <w:tab w:val="right" w:leader="dot" w:pos="9062"/>
             </w:tabs>
@@ -634,7 +648,7 @@
           <w:hyperlink w:anchor="_Toc200298676" w:history="1">
             <w:r>
               <w:rPr>
-                <w:rStyle w:val="Hiperpovezava"/>
+                <w:rStyle w:val="Hyperlink"/>
                 <w:noProof/>
               </w:rPr>
               <w:t>Simuliran zaledni sistem in operaterska platforma</w:t>
@@ -691,7 +705,7 @@
         </w:p>
         <w:p>
           <w:pPr>
-            <w:pStyle w:val="Kazalovsebine1"/>
+            <w:pStyle w:val="TOC1"/>
             <w:tabs>
               <w:tab w:val="right" w:leader="dot" w:pos="9062"/>
             </w:tabs>
@@ -706,7 +720,7 @@
           <w:hyperlink w:anchor="_Toc200298677" w:history="1">
             <w:r>
               <w:rPr>
-                <w:rStyle w:val="Hiperpovezava"/>
+                <w:rStyle w:val="Hyperlink"/>
                 <w:noProof/>
               </w:rPr>
               <w:t>REST vmesnik</w:t>
@@ -763,7 +777,7 @@
         </w:p>
         <w:p>
           <w:pPr>
-            <w:pStyle w:val="Kazalovsebine1"/>
+            <w:pStyle w:val="TOC1"/>
             <w:tabs>
               <w:tab w:val="right" w:leader="dot" w:pos="9062"/>
             </w:tabs>
@@ -778,7 +792,7 @@
           <w:hyperlink w:anchor="_Toc200298678" w:history="1">
             <w:r>
               <w:rPr>
-                <w:rStyle w:val="Hiperpovezava"/>
+                <w:rStyle w:val="Hyperlink"/>
                 <w:noProof/>
               </w:rPr>
               <w:t>Igrifikacija – pregled rešitve</w:t>
@@ -835,7 +849,7 @@
         </w:p>
         <w:p>
           <w:pPr>
-            <w:pStyle w:val="Kazalovsebine1"/>
+            <w:pStyle w:val="TOC1"/>
             <w:tabs>
               <w:tab w:val="right" w:leader="dot" w:pos="9062"/>
             </w:tabs>
@@ -850,7 +864,7 @@
           <w:hyperlink w:anchor="_Toc200298679" w:history="1">
             <w:r>
               <w:rPr>
-                <w:rStyle w:val="Hiperpovezava"/>
+                <w:rStyle w:val="Hyperlink"/>
                 <w:noProof/>
               </w:rPr>
               <w:t>Struktura uporabniških vmesnikov</w:t>
@@ -907,7 +921,7 @@
         </w:p>
         <w:p>
           <w:pPr>
-            <w:pStyle w:val="Kazalovsebine2"/>
+            <w:pStyle w:val="TOC2"/>
             <w:tabs>
               <w:tab w:val="right" w:leader="dot" w:pos="9062"/>
             </w:tabs>
@@ -922,7 +936,7 @@
           <w:hyperlink w:anchor="_Toc200298680" w:history="1">
             <w:r>
               <w:rPr>
-                <w:rStyle w:val="Hiperpovezava"/>
+                <w:rStyle w:val="Hyperlink"/>
                 <w:noProof/>
               </w:rPr>
               <w:t>Začetni zaslon</w:t>
@@ -979,7 +993,7 @@
         </w:p>
         <w:p>
           <w:pPr>
-            <w:pStyle w:val="Kazalovsebine2"/>
+            <w:pStyle w:val="TOC2"/>
             <w:tabs>
               <w:tab w:val="right" w:leader="dot" w:pos="9062"/>
             </w:tabs>
@@ -994,7 +1008,7 @@
           <w:hyperlink w:anchor="_Toc200298681" w:history="1">
             <w:r>
               <w:rPr>
-                <w:rStyle w:val="Hiperpovezava"/>
+                <w:rStyle w:val="Hyperlink"/>
                 <w:noProof/>
               </w:rPr>
               <w:t>Zaslon igre</w:t>
@@ -1051,7 +1065,7 @@
         </w:p>
         <w:p>
           <w:pPr>
-            <w:pStyle w:val="Kazalovsebine2"/>
+            <w:pStyle w:val="TOC2"/>
             <w:tabs>
               <w:tab w:val="right" w:leader="dot" w:pos="9062"/>
             </w:tabs>
@@ -1066,7 +1080,7 @@
           <w:hyperlink w:anchor="_Toc200298682" w:history="1">
             <w:r>
               <w:rPr>
-                <w:rStyle w:val="Hiperpovezava"/>
+                <w:rStyle w:val="Hyperlink"/>
                 <w:noProof/>
               </w:rPr>
               <w:t>Zaslon z rezultati</w:t>
@@ -1123,7 +1137,7 @@
         </w:p>
         <w:p>
           <w:pPr>
-            <w:pStyle w:val="Kazalovsebine1"/>
+            <w:pStyle w:val="TOC1"/>
             <w:tabs>
               <w:tab w:val="right" w:leader="dot" w:pos="9062"/>
             </w:tabs>
@@ -1138,7 +1152,7 @@
           <w:hyperlink w:anchor="_Toc200298683" w:history="1">
             <w:r>
               <w:rPr>
-                <w:rStyle w:val="Hiperpovezava"/>
+                <w:rStyle w:val="Hyperlink"/>
                 <w:noProof/>
               </w:rPr>
               <w:t>Struktura rešitve</w:t>
@@ -1195,7 +1209,7 @@
         </w:p>
         <w:p>
           <w:pPr>
-            <w:pStyle w:val="Kazalovsebine1"/>
+            <w:pStyle w:val="TOC1"/>
             <w:tabs>
               <w:tab w:val="right" w:leader="dot" w:pos="9062"/>
             </w:tabs>
@@ -1210,7 +1224,7 @@
           <w:hyperlink w:anchor="_Toc200298684" w:history="1">
             <w:r>
               <w:rPr>
-                <w:rStyle w:val="Hiperpovezava"/>
+                <w:rStyle w:val="Hyperlink"/>
                 <w:noProof/>
               </w:rPr>
               <w:t>Zunanje odvisnosti aplikacije</w:t>
@@ -1267,7 +1281,7 @@
         </w:p>
         <w:p>
           <w:pPr>
-            <w:pStyle w:val="Kazalovsebine1"/>
+            <w:pStyle w:val="TOC1"/>
             <w:tabs>
               <w:tab w:val="right" w:leader="dot" w:pos="9062"/>
             </w:tabs>
@@ -1282,7 +1296,7 @@
           <w:hyperlink w:anchor="_Toc200298685" w:history="1">
             <w:r>
               <w:rPr>
-                <w:rStyle w:val="Hiperpovezava"/>
+                <w:rStyle w:val="Hyperlink"/>
                 <w:noProof/>
               </w:rPr>
               <w:t>Navodila za zagon</w:t>
@@ -1339,7 +1353,7 @@
         </w:p>
         <w:p>
           <w:pPr>
-            <w:pStyle w:val="Kazalovsebine1"/>
+            <w:pStyle w:val="TOC1"/>
             <w:tabs>
               <w:tab w:val="right" w:leader="dot" w:pos="9062"/>
             </w:tabs>
@@ -1354,7 +1368,7 @@
           <w:hyperlink w:anchor="_Toc200298686" w:history="1">
             <w:r>
               <w:rPr>
-                <w:rStyle w:val="Hiperpovezava"/>
+                <w:rStyle w:val="Hyperlink"/>
                 <w:noProof/>
               </w:rPr>
               <w:t>Navodila za nadaljnji razvoj</w:t>
@@ -1411,7 +1425,7 @@
         </w:p>
         <w:p>
           <w:pPr>
-            <w:pStyle w:val="Kazalovsebine1"/>
+            <w:pStyle w:val="TOC1"/>
             <w:tabs>
               <w:tab w:val="right" w:leader="dot" w:pos="9062"/>
             </w:tabs>
@@ -1426,7 +1440,7 @@
           <w:hyperlink w:anchor="_Toc200298687" w:history="1">
             <w:r>
               <w:rPr>
-                <w:rStyle w:val="Hiperpovezava"/>
+                <w:rStyle w:val="Hyperlink"/>
                 <w:noProof/>
               </w:rPr>
               <w:t>Odprte pomanjkljivosti in napake</w:t>
@@ -1483,7 +1497,7 @@
         </w:p>
         <w:p>
           <w:pPr>
-            <w:pStyle w:val="Kazalovsebine1"/>
+            <w:pStyle w:val="TOC1"/>
             <w:tabs>
               <w:tab w:val="right" w:leader="dot" w:pos="9062"/>
             </w:tabs>
@@ -1498,7 +1512,7 @@
           <w:hyperlink w:anchor="_Toc200298688" w:history="1">
             <w:r>
               <w:rPr>
-                <w:rStyle w:val="Hiperpovezava"/>
+                <w:rStyle w:val="Hyperlink"/>
                 <w:noProof/>
               </w:rPr>
               <w:t>Prevzem rešitve</w:t>
@@ -1662,7 +1676,7 @@
     </w:p>
     <w:p>
       <w:pPr>
-        <w:pStyle w:val="Naslov1"/>
+        <w:pStyle w:val="Heading1"/>
       </w:pPr>
       <w:bookmarkStart w:id="0" w:name="_Toc200298672"/>
       <w:r>
@@ -1917,7 +1931,7 @@
     </w:p>
     <w:p>
       <w:pPr>
-        <w:pStyle w:val="Odstavekseznama"/>
+        <w:pStyle w:val="ListParagraph"/>
         <w:numPr>
           <w:ilvl w:val="0"/>
           <w:numId w:val="25"/>
@@ -1947,7 +1961,7 @@
     </w:p>
     <w:p>
       <w:pPr>
-        <w:pStyle w:val="Odstavekseznama"/>
+        <w:pStyle w:val="ListParagraph"/>
         <w:spacing w:line="276" w:lineRule="auto"/>
         <w:rPr>
           <w:sz w:val="24"/>
@@ -1957,7 +1971,7 @@
     </w:p>
     <w:p>
       <w:pPr>
-        <w:pStyle w:val="Odstavekseznama"/>
+        <w:pStyle w:val="ListParagraph"/>
         <w:numPr>
           <w:ilvl w:val="0"/>
           <w:numId w:val="24"/>
@@ -1978,7 +1992,7 @@
     </w:p>
     <w:p>
       <w:pPr>
-        <w:pStyle w:val="Odstavekseznama"/>
+        <w:pStyle w:val="ListParagraph"/>
         <w:numPr>
           <w:ilvl w:val="0"/>
           <w:numId w:val="24"/>
@@ -1999,7 +2013,7 @@
     </w:p>
     <w:p>
       <w:pPr>
-        <w:pStyle w:val="Odstavekseznama"/>
+        <w:pStyle w:val="ListParagraph"/>
         <w:numPr>
           <w:ilvl w:val="0"/>
           <w:numId w:val="24"/>
@@ -2020,7 +2034,7 @@
     </w:p>
     <w:p>
       <w:pPr>
-        <w:pStyle w:val="Odstavekseznama"/>
+        <w:pStyle w:val="ListParagraph"/>
         <w:numPr>
           <w:ilvl w:val="0"/>
           <w:numId w:val="24"/>
@@ -2048,7 +2062,7 @@
     </w:p>
     <w:p>
       <w:pPr>
-        <w:pStyle w:val="Odstavekseznama"/>
+        <w:pStyle w:val="ListParagraph"/>
         <w:numPr>
           <w:ilvl w:val="0"/>
           <w:numId w:val="24"/>
@@ -2069,7 +2083,7 @@
     </w:p>
     <w:p>
       <w:pPr>
-        <w:pStyle w:val="Odstavekseznama"/>
+        <w:pStyle w:val="ListParagraph"/>
         <w:numPr>
           <w:ilvl w:val="0"/>
           <w:numId w:val="24"/>
@@ -2099,7 +2113,7 @@
     </w:p>
     <w:p>
       <w:pPr>
-        <w:pStyle w:val="Odstavekseznama"/>
+        <w:pStyle w:val="ListParagraph"/>
         <w:numPr>
           <w:ilvl w:val="0"/>
           <w:numId w:val="27"/>
@@ -2124,7 +2138,7 @@
     </w:p>
     <w:p>
       <w:pPr>
-        <w:pStyle w:val="Odstavekseznama"/>
+        <w:pStyle w:val="ListParagraph"/>
         <w:numPr>
           <w:ilvl w:val="0"/>
           <w:numId w:val="27"/>
@@ -2156,7 +2170,7 @@
     </w:p>
     <w:p>
       <w:pPr>
-        <w:pStyle w:val="Odstavekseznama"/>
+        <w:pStyle w:val="ListParagraph"/>
         <w:numPr>
           <w:ilvl w:val="0"/>
           <w:numId w:val="27"/>
@@ -2343,7 +2357,7 @@
     <w:p/>
     <w:p>
       <w:pPr>
-        <w:pStyle w:val="Naslov1"/>
+        <w:pStyle w:val="Heading1"/>
       </w:pPr>
       <w:bookmarkStart w:id="1" w:name="_Toc200298673"/>
       <w:r>
@@ -2355,7 +2369,7 @@
     <w:p/>
     <w:p>
       <w:pPr>
-        <w:pStyle w:val="Naslov2"/>
+        <w:pStyle w:val="Heading2"/>
       </w:pPr>
       <w:bookmarkStart w:id="2" w:name="_Toc200298674"/>
       <w:r>
@@ -2897,7 +2911,7 @@
     </w:p>
     <w:p>
       <w:pPr>
-        <w:pStyle w:val="Naslov2"/>
+        <w:pStyle w:val="Heading2"/>
       </w:pPr>
       <w:bookmarkStart w:id="3" w:name="_Toc200298675"/>
       <w:r>
@@ -2991,7 +3005,7 @@
     </w:p>
     <w:p>
       <w:pPr>
-        <w:pStyle w:val="Odstavekseznama"/>
+        <w:pStyle w:val="ListParagraph"/>
         <w:numPr>
           <w:ilvl w:val="0"/>
           <w:numId w:val="28"/>
@@ -3011,7 +3025,7 @@
     </w:p>
     <w:p>
       <w:pPr>
-        <w:pStyle w:val="Odstavekseznama"/>
+        <w:pStyle w:val="ListParagraph"/>
         <w:numPr>
           <w:ilvl w:val="0"/>
           <w:numId w:val="28"/>
@@ -3031,7 +3045,7 @@
     </w:p>
     <w:p>
       <w:pPr>
-        <w:pStyle w:val="Odstavekseznama"/>
+        <w:pStyle w:val="ListParagraph"/>
         <w:numPr>
           <w:ilvl w:val="0"/>
           <w:numId w:val="28"/>
@@ -3051,7 +3065,7 @@
     </w:p>
     <w:p>
       <w:pPr>
-        <w:pStyle w:val="Odstavekseznama"/>
+        <w:pStyle w:val="ListParagraph"/>
         <w:numPr>
           <w:ilvl w:val="0"/>
           <w:numId w:val="28"/>
@@ -3071,7 +3085,7 @@
     </w:p>
     <w:p>
       <w:pPr>
-        <w:pStyle w:val="Odstavekseznama"/>
+        <w:pStyle w:val="ListParagraph"/>
         <w:numPr>
           <w:ilvl w:val="0"/>
           <w:numId w:val="28"/>
@@ -3091,7 +3105,7 @@
     </w:p>
     <w:p>
       <w:pPr>
-        <w:pStyle w:val="Odstavekseznama"/>
+        <w:pStyle w:val="ListParagraph"/>
         <w:numPr>
           <w:ilvl w:val="0"/>
           <w:numId w:val="28"/>
@@ -3134,7 +3148,7 @@
     </w:p>
     <w:p>
       <w:pPr>
-        <w:pStyle w:val="Odstavekseznama"/>
+        <w:pStyle w:val="ListParagraph"/>
         <w:numPr>
           <w:ilvl w:val="0"/>
           <w:numId w:val="29"/>
@@ -3186,7 +3200,7 @@
     </w:p>
     <w:p>
       <w:pPr>
-        <w:pStyle w:val="Odstavekseznama"/>
+        <w:pStyle w:val="ListParagraph"/>
         <w:numPr>
           <w:ilvl w:val="0"/>
           <w:numId w:val="29"/>
@@ -3222,7 +3236,7 @@
     </w:p>
     <w:p>
       <w:pPr>
-        <w:pStyle w:val="Odstavekseznama"/>
+        <w:pStyle w:val="ListParagraph"/>
         <w:numPr>
           <w:ilvl w:val="0"/>
           <w:numId w:val="29"/>
@@ -3242,7 +3256,7 @@
     </w:p>
     <w:p>
       <w:pPr>
-        <w:pStyle w:val="Odstavekseznama"/>
+        <w:pStyle w:val="ListParagraph"/>
         <w:numPr>
           <w:ilvl w:val="0"/>
           <w:numId w:val="29"/>
@@ -3338,7 +3352,7 @@
     </w:p>
     <w:p>
       <w:pPr>
-        <w:pStyle w:val="Odstavekseznama"/>
+        <w:pStyle w:val="ListParagraph"/>
         <w:numPr>
           <w:ilvl w:val="0"/>
           <w:numId w:val="30"/>
@@ -3358,7 +3372,7 @@
     </w:p>
     <w:p>
       <w:pPr>
-        <w:pStyle w:val="Odstavekseznama"/>
+        <w:pStyle w:val="ListParagraph"/>
         <w:numPr>
           <w:ilvl w:val="0"/>
           <w:numId w:val="30"/>
@@ -3378,7 +3392,7 @@
     </w:p>
     <w:p>
       <w:pPr>
-        <w:pStyle w:val="Odstavekseznama"/>
+        <w:pStyle w:val="ListParagraph"/>
         <w:numPr>
           <w:ilvl w:val="0"/>
           <w:numId w:val="30"/>
@@ -3398,7 +3412,7 @@
     </w:p>
     <w:p>
       <w:pPr>
-        <w:pStyle w:val="Odstavekseznama"/>
+        <w:pStyle w:val="ListParagraph"/>
         <w:numPr>
           <w:ilvl w:val="0"/>
           <w:numId w:val="30"/>
@@ -3441,7 +3455,7 @@
     </w:p>
     <w:p>
       <w:pPr>
-        <w:pStyle w:val="Odstavekseznama"/>
+        <w:pStyle w:val="ListParagraph"/>
         <w:numPr>
           <w:ilvl w:val="0"/>
           <w:numId w:val="31"/>
@@ -3477,7 +3491,7 @@
     </w:p>
     <w:p>
       <w:pPr>
-        <w:pStyle w:val="Odstavekseznama"/>
+        <w:pStyle w:val="ListParagraph"/>
         <w:numPr>
           <w:ilvl w:val="0"/>
           <w:numId w:val="31"/>
@@ -3513,7 +3527,7 @@
     </w:p>
     <w:p>
       <w:pPr>
-        <w:pStyle w:val="Odstavekseznama"/>
+        <w:pStyle w:val="ListParagraph"/>
         <w:numPr>
           <w:ilvl w:val="0"/>
           <w:numId w:val="31"/>
@@ -3610,7 +3624,7 @@
     </w:p>
     <w:p>
       <w:pPr>
-        <w:pStyle w:val="Odstavekseznama"/>
+        <w:pStyle w:val="ListParagraph"/>
         <w:numPr>
           <w:ilvl w:val="0"/>
           <w:numId w:val="32"/>
@@ -3630,7 +3644,7 @@
     </w:p>
     <w:p>
       <w:pPr>
-        <w:pStyle w:val="Odstavekseznama"/>
+        <w:pStyle w:val="ListParagraph"/>
         <w:numPr>
           <w:ilvl w:val="0"/>
           <w:numId w:val="32"/>
@@ -3650,7 +3664,7 @@
     </w:p>
     <w:p>
       <w:pPr>
-        <w:pStyle w:val="Odstavekseznama"/>
+        <w:pStyle w:val="ListParagraph"/>
         <w:numPr>
           <w:ilvl w:val="0"/>
           <w:numId w:val="32"/>
@@ -3686,7 +3700,7 @@
     </w:p>
     <w:p>
       <w:pPr>
-        <w:pStyle w:val="Odstavekseznama"/>
+        <w:pStyle w:val="ListParagraph"/>
         <w:numPr>
           <w:ilvl w:val="0"/>
           <w:numId w:val="32"/>
@@ -3729,7 +3743,7 @@
     </w:p>
     <w:p>
       <w:pPr>
-        <w:pStyle w:val="Odstavekseznama"/>
+        <w:pStyle w:val="ListParagraph"/>
         <w:numPr>
           <w:ilvl w:val="0"/>
           <w:numId w:val="33"/>
@@ -3765,7 +3779,7 @@
     </w:p>
     <w:p>
       <w:pPr>
-        <w:pStyle w:val="Odstavekseznama"/>
+        <w:pStyle w:val="ListParagraph"/>
         <w:numPr>
           <w:ilvl w:val="0"/>
           <w:numId w:val="33"/>
@@ -3785,7 +3799,7 @@
     </w:p>
     <w:p>
       <w:pPr>
-        <w:pStyle w:val="Odstavekseznama"/>
+        <w:pStyle w:val="ListParagraph"/>
         <w:numPr>
           <w:ilvl w:val="0"/>
           <w:numId w:val="33"/>
@@ -3881,7 +3895,7 @@
     </w:p>
     <w:p>
       <w:pPr>
-        <w:pStyle w:val="Odstavekseznama"/>
+        <w:pStyle w:val="ListParagraph"/>
         <w:numPr>
           <w:ilvl w:val="0"/>
           <w:numId w:val="34"/>
@@ -3901,7 +3915,7 @@
     </w:p>
     <w:p>
       <w:pPr>
-        <w:pStyle w:val="Odstavekseznama"/>
+        <w:pStyle w:val="ListParagraph"/>
         <w:numPr>
           <w:ilvl w:val="0"/>
           <w:numId w:val="34"/>
@@ -3921,7 +3935,7 @@
     </w:p>
     <w:p>
       <w:pPr>
-        <w:pStyle w:val="Odstavekseznama"/>
+        <w:pStyle w:val="ListParagraph"/>
         <w:numPr>
           <w:ilvl w:val="0"/>
           <w:numId w:val="34"/>
@@ -3941,7 +3955,7 @@
     </w:p>
     <w:p>
       <w:pPr>
-        <w:pStyle w:val="Odstavekseznama"/>
+        <w:pStyle w:val="ListParagraph"/>
         <w:numPr>
           <w:ilvl w:val="0"/>
           <w:numId w:val="34"/>
@@ -3961,7 +3975,7 @@
     </w:p>
     <w:p>
       <w:pPr>
-        <w:pStyle w:val="Odstavekseznama"/>
+        <w:pStyle w:val="ListParagraph"/>
         <w:numPr>
           <w:ilvl w:val="0"/>
           <w:numId w:val="34"/>
@@ -4004,7 +4018,7 @@
     </w:p>
     <w:p>
       <w:pPr>
-        <w:pStyle w:val="Odstavekseznama"/>
+        <w:pStyle w:val="ListParagraph"/>
         <w:numPr>
           <w:ilvl w:val="0"/>
           <w:numId w:val="35"/>
@@ -4024,7 +4038,7 @@
     </w:p>
     <w:p>
       <w:pPr>
-        <w:pStyle w:val="Odstavekseznama"/>
+        <w:pStyle w:val="ListParagraph"/>
         <w:numPr>
           <w:ilvl w:val="0"/>
           <w:numId w:val="35"/>
@@ -4044,7 +4058,7 @@
     </w:p>
     <w:p>
       <w:pPr>
-        <w:pStyle w:val="Odstavekseznama"/>
+        <w:pStyle w:val="ListParagraph"/>
         <w:numPr>
           <w:ilvl w:val="0"/>
           <w:numId w:val="35"/>
@@ -4181,7 +4195,7 @@
     </w:p>
     <w:p>
       <w:pPr>
-        <w:pStyle w:val="Odstavekseznama"/>
+        <w:pStyle w:val="ListParagraph"/>
         <w:numPr>
           <w:ilvl w:val="0"/>
           <w:numId w:val="36"/>
@@ -4201,7 +4215,7 @@
     </w:p>
     <w:p>
       <w:pPr>
-        <w:pStyle w:val="Odstavekseznama"/>
+        <w:pStyle w:val="ListParagraph"/>
         <w:numPr>
           <w:ilvl w:val="0"/>
           <w:numId w:val="36"/>
@@ -4221,7 +4235,7 @@
     </w:p>
     <w:p>
       <w:pPr>
-        <w:pStyle w:val="Odstavekseznama"/>
+        <w:pStyle w:val="ListParagraph"/>
         <w:numPr>
           <w:ilvl w:val="0"/>
           <w:numId w:val="36"/>
@@ -4241,7 +4255,7 @@
     </w:p>
     <w:p>
       <w:pPr>
-        <w:pStyle w:val="Odstavekseznama"/>
+        <w:pStyle w:val="ListParagraph"/>
         <w:numPr>
           <w:ilvl w:val="0"/>
           <w:numId w:val="36"/>
@@ -4284,7 +4298,7 @@
     </w:p>
     <w:p>
       <w:pPr>
-        <w:pStyle w:val="Odstavekseznama"/>
+        <w:pStyle w:val="ListParagraph"/>
         <w:numPr>
           <w:ilvl w:val="0"/>
           <w:numId w:val="37"/>
@@ -4320,7 +4334,7 @@
     </w:p>
     <w:p>
       <w:pPr>
-        <w:pStyle w:val="Odstavekseznama"/>
+        <w:pStyle w:val="ListParagraph"/>
         <w:numPr>
           <w:ilvl w:val="0"/>
           <w:numId w:val="37"/>
@@ -4356,7 +4370,7 @@
     </w:p>
     <w:p>
       <w:pPr>
-        <w:pStyle w:val="Odstavekseznama"/>
+        <w:pStyle w:val="ListParagraph"/>
         <w:numPr>
           <w:ilvl w:val="0"/>
           <w:numId w:val="37"/>
@@ -4459,7 +4473,7 @@
     </w:p>
     <w:p>
       <w:pPr>
-        <w:pStyle w:val="Odstavekseznama"/>
+        <w:pStyle w:val="ListParagraph"/>
         <w:numPr>
           <w:ilvl w:val="0"/>
           <w:numId w:val="38"/>
@@ -4479,7 +4493,7 @@
     </w:p>
     <w:p>
       <w:pPr>
-        <w:pStyle w:val="Odstavekseznama"/>
+        <w:pStyle w:val="ListParagraph"/>
         <w:numPr>
           <w:ilvl w:val="0"/>
           <w:numId w:val="38"/>
@@ -4499,7 +4513,7 @@
     </w:p>
     <w:p>
       <w:pPr>
-        <w:pStyle w:val="Odstavekseznama"/>
+        <w:pStyle w:val="ListParagraph"/>
         <w:numPr>
           <w:ilvl w:val="0"/>
           <w:numId w:val="38"/>
@@ -4519,7 +4533,7 @@
     </w:p>
     <w:p>
       <w:pPr>
-        <w:pStyle w:val="Odstavekseznama"/>
+        <w:pStyle w:val="ListParagraph"/>
         <w:numPr>
           <w:ilvl w:val="0"/>
           <w:numId w:val="38"/>
@@ -4549,7 +4563,7 @@
     <w:p/>
     <w:p>
       <w:pPr>
-        <w:pStyle w:val="Naslov1"/>
+        <w:pStyle w:val="Heading1"/>
       </w:pPr>
       <w:bookmarkStart w:id="4" w:name="_Toc200298676"/>
       <w:r>
@@ -5041,7 +5055,7 @@
     <w:p/>
     <w:p>
       <w:pPr>
-        <w:pStyle w:val="Naslov1"/>
+        <w:pStyle w:val="Heading1"/>
       </w:pPr>
       <w:bookmarkStart w:id="5" w:name="_Toc200298677"/>
       <w:r>
@@ -5110,7 +5124,7 @@
     <w:p/>
     <w:p>
       <w:pPr>
-        <w:pStyle w:val="Naslov1"/>
+        <w:pStyle w:val="Heading1"/>
       </w:pPr>
       <w:bookmarkStart w:id="6" w:name="_Toc200298678"/>
       <w:proofErr w:type="spellStart"/>
@@ -5154,7 +5168,7 @@
     <w:p/>
     <w:p>
       <w:pPr>
-        <w:pStyle w:val="Naslov1"/>
+        <w:pStyle w:val="Heading1"/>
       </w:pPr>
       <w:bookmarkStart w:id="7" w:name="_Toc200298679"/>
       <w:r>
@@ -5166,10 +5180,387 @@
     <w:p/>
     <w:p>
       <w:pPr>
-        <w:pStyle w:val="Naslov2"/>
+        <w:pStyle w:val="Heading2"/>
       </w:pPr>
       <w:bookmarkStart w:id="8" w:name="_Toc200298680"/>
       <w:r>
+        <w:t>Prijava</w:t>
+      </w:r>
+      <w:r>
+        <w:t xml:space="preserve"> in registracija</w:t>
+      </w:r>
+    </w:p>
+    <w:p>
+      <w:pPr>
+        <w:rPr>
+          <w:lang w:val="en-GB"/>
+        </w:rPr>
+      </w:pPr>
+      <w:proofErr w:type="spellStart"/>
+      <w:r>
+        <w:rPr>
+          <w:lang w:val="en-GB"/>
+        </w:rPr>
+        <w:t>Vsak</w:t>
+      </w:r>
+      <w:proofErr w:type="spellEnd"/>
+      <w:r>
+        <w:rPr>
+          <w:lang w:val="en-GB"/>
+        </w:rPr>
+        <w:t xml:space="preserve"> Uporabnik se mora pred </w:t>
+      </w:r>
+      <w:proofErr w:type="spellStart"/>
+      <w:r>
+        <w:rPr>
+          <w:lang w:val="en-GB"/>
+        </w:rPr>
+        <w:t>uporabo</w:t>
+      </w:r>
+      <w:proofErr w:type="spellEnd"/>
+      <w:r>
+        <w:rPr>
+          <w:lang w:val="en-GB"/>
+        </w:rPr>
+        <w:t xml:space="preserve"> </w:t>
+      </w:r>
+      <w:proofErr w:type="spellStart"/>
+      <w:r>
+        <w:rPr>
+          <w:lang w:val="en-GB"/>
+        </w:rPr>
+        <w:t>aplikacije</w:t>
+      </w:r>
+      <w:proofErr w:type="spellEnd"/>
+      <w:r>
+        <w:rPr>
+          <w:lang w:val="en-GB"/>
+        </w:rPr>
+        <w:t xml:space="preserve"> </w:t>
+      </w:r>
+      <w:proofErr w:type="spellStart"/>
+      <w:r>
+        <w:rPr>
+          <w:lang w:val="en-GB"/>
+        </w:rPr>
+        <w:t>registrirati</w:t>
+      </w:r>
+      <w:proofErr w:type="spellEnd"/>
+      <w:r>
+        <w:rPr>
+          <w:lang w:val="en-GB"/>
+        </w:rPr>
+        <w:t xml:space="preserve"> </w:t>
+      </w:r>
+      <w:r>
+        <w:rPr>
+          <w:lang w:val="en-GB"/>
+        </w:rPr>
+        <w:t xml:space="preserve">in </w:t>
+      </w:r>
+      <w:proofErr w:type="spellStart"/>
+      <w:r>
+        <w:rPr>
+          <w:lang w:val="en-GB"/>
+        </w:rPr>
+        <w:t>prijaviti</w:t>
+      </w:r>
+      <w:proofErr w:type="spellEnd"/>
+      <w:r>
+        <w:rPr>
+          <w:lang w:val="en-GB"/>
+        </w:rPr>
+        <w:t xml:space="preserve">. </w:t>
+      </w:r>
+      <w:proofErr w:type="spellStart"/>
+      <w:r>
+        <w:rPr>
+          <w:lang w:val="en-GB"/>
+        </w:rPr>
+        <w:t>Oboje</w:t>
+      </w:r>
+      <w:proofErr w:type="spellEnd"/>
+      <w:r>
+        <w:rPr>
+          <w:lang w:val="en-GB"/>
+        </w:rPr>
+        <w:t xml:space="preserve"> </w:t>
+      </w:r>
+      <w:proofErr w:type="spellStart"/>
+      <w:r>
+        <w:rPr>
+          <w:lang w:val="en-GB"/>
+        </w:rPr>
+        <w:t>lahko</w:t>
+      </w:r>
+      <w:proofErr w:type="spellEnd"/>
+      <w:r>
+        <w:rPr>
+          <w:lang w:val="en-GB"/>
+        </w:rPr>
+        <w:t xml:space="preserve"> </w:t>
+      </w:r>
+      <w:proofErr w:type="spellStart"/>
+      <w:r>
+        <w:rPr>
+          <w:lang w:val="en-GB"/>
+        </w:rPr>
+        <w:t>stori</w:t>
+      </w:r>
+      <w:proofErr w:type="spellEnd"/>
+      <w:r>
+        <w:rPr>
+          <w:lang w:val="en-GB"/>
+        </w:rPr>
+        <w:t xml:space="preserve"> </w:t>
+      </w:r>
+      <w:proofErr w:type="spellStart"/>
+      <w:r>
+        <w:rPr>
+          <w:lang w:val="en-GB"/>
+        </w:rPr>
+        <w:t>ali</w:t>
+      </w:r>
+      <w:proofErr w:type="spellEnd"/>
+      <w:r>
+        <w:rPr>
+          <w:lang w:val="en-GB"/>
+        </w:rPr>
+        <w:t xml:space="preserve"> </w:t>
+      </w:r>
+      <w:r>
+        <w:rPr>
+          <w:lang w:val="en-GB"/>
+        </w:rPr>
+        <w:t xml:space="preserve">z </w:t>
+      </w:r>
+      <w:proofErr w:type="spellStart"/>
+      <w:r>
+        <w:rPr>
+          <w:lang w:val="en-GB"/>
+        </w:rPr>
+        <w:t>vnosom</w:t>
+      </w:r>
+      <w:proofErr w:type="spellEnd"/>
+      <w:r>
+        <w:rPr>
+          <w:lang w:val="en-GB"/>
+        </w:rPr>
+        <w:t xml:space="preserve"> e-</w:t>
+      </w:r>
+      <w:proofErr w:type="spellStart"/>
+      <w:r>
+        <w:rPr>
+          <w:lang w:val="en-GB"/>
+        </w:rPr>
+        <w:t>poštnega</w:t>
+      </w:r>
+      <w:proofErr w:type="spellEnd"/>
+      <w:r>
+        <w:rPr>
+          <w:lang w:val="en-GB"/>
+        </w:rPr>
+        <w:t xml:space="preserve"> </w:t>
+      </w:r>
+      <w:proofErr w:type="spellStart"/>
+      <w:r>
+        <w:rPr>
+          <w:lang w:val="en-GB"/>
+        </w:rPr>
+        <w:t>naslova</w:t>
+      </w:r>
+      <w:proofErr w:type="spellEnd"/>
+      <w:r>
+        <w:rPr>
+          <w:lang w:val="en-GB"/>
+        </w:rPr>
+        <w:t xml:space="preserve"> in </w:t>
+      </w:r>
+      <w:proofErr w:type="spellStart"/>
+      <w:r>
+        <w:rPr>
+          <w:lang w:val="en-GB"/>
+        </w:rPr>
+        <w:t>gesla</w:t>
+      </w:r>
+      <w:proofErr w:type="spellEnd"/>
+      <w:r>
+        <w:rPr>
+          <w:lang w:val="en-GB"/>
+        </w:rPr>
+        <w:t xml:space="preserve"> </w:t>
+      </w:r>
+      <w:proofErr w:type="spellStart"/>
+      <w:r>
+        <w:rPr>
+          <w:lang w:val="en-GB"/>
+        </w:rPr>
+        <w:t>ali</w:t>
+      </w:r>
+      <w:proofErr w:type="spellEnd"/>
+      <w:r>
+        <w:rPr>
+          <w:lang w:val="en-GB"/>
+        </w:rPr>
+        <w:t xml:space="preserve"> z </w:t>
+      </w:r>
+      <w:proofErr w:type="spellStart"/>
+      <w:r>
+        <w:rPr>
+          <w:lang w:val="en-GB"/>
+        </w:rPr>
+        <w:t>uporabo</w:t>
+      </w:r>
+      <w:proofErr w:type="spellEnd"/>
+      <w:r>
+        <w:rPr>
+          <w:lang w:val="en-GB"/>
+        </w:rPr>
+        <w:t xml:space="preserve"> </w:t>
+      </w:r>
+      <w:proofErr w:type="spellStart"/>
+      <w:r>
+        <w:rPr>
+          <w:lang w:val="en-GB"/>
+        </w:rPr>
+        <w:t>funkcionalnosti</w:t>
+      </w:r>
+      <w:proofErr w:type="spellEnd"/>
+      <w:r>
+        <w:rPr>
+          <w:lang w:val="en-GB"/>
+        </w:rPr>
+        <w:t xml:space="preserve"> Google Sign-in</w:t>
+      </w:r>
+      <w:r>
+        <w:rPr>
+          <w:lang w:val="en-GB"/>
+        </w:rPr>
+        <w:t>.</w:t>
+      </w:r>
+      <w:r>
+        <w:rPr>
+          <w:lang w:val="en-GB"/>
+        </w:rPr>
+        <w:t xml:space="preserve"> </w:t>
+      </w:r>
+      <w:proofErr w:type="spellStart"/>
+      <w:r>
+        <w:rPr>
+          <w:lang w:val="en-GB"/>
+        </w:rPr>
+        <w:t>Registracijski</w:t>
+      </w:r>
+      <w:proofErr w:type="spellEnd"/>
+      <w:r>
+        <w:rPr>
+          <w:lang w:val="en-GB"/>
+        </w:rPr>
+        <w:t xml:space="preserve"> </w:t>
+      </w:r>
+      <w:proofErr w:type="spellStart"/>
+      <w:r>
+        <w:rPr>
+          <w:lang w:val="en-GB"/>
+        </w:rPr>
+        <w:t>podatki</w:t>
+      </w:r>
+      <w:proofErr w:type="spellEnd"/>
+      <w:r>
+        <w:rPr>
+          <w:lang w:val="en-GB"/>
+        </w:rPr>
+        <w:t xml:space="preserve"> so </w:t>
+      </w:r>
+      <w:proofErr w:type="spellStart"/>
+      <w:r>
+        <w:rPr>
+          <w:lang w:val="en-GB"/>
+        </w:rPr>
+        <w:t>shranjeni</w:t>
+      </w:r>
+      <w:proofErr w:type="spellEnd"/>
+      <w:r>
+        <w:rPr>
+          <w:lang w:val="en-GB"/>
+        </w:rPr>
+        <w:t xml:space="preserve"> v Firebase</w:t>
+      </w:r>
+      <w:r>
+        <w:rPr>
+          <w:lang w:val="en-GB"/>
+        </w:rPr>
+        <w:t xml:space="preserve">, </w:t>
+      </w:r>
+      <w:proofErr w:type="spellStart"/>
+      <w:r>
+        <w:rPr>
+          <w:lang w:val="en-GB"/>
+        </w:rPr>
+        <w:t>prijavni</w:t>
+      </w:r>
+      <w:proofErr w:type="spellEnd"/>
+      <w:r>
+        <w:rPr>
+          <w:lang w:val="en-GB"/>
+        </w:rPr>
+        <w:t xml:space="preserve"> </w:t>
+      </w:r>
+      <w:proofErr w:type="spellStart"/>
+      <w:r>
+        <w:rPr>
+          <w:lang w:val="en-GB"/>
+        </w:rPr>
+        <w:t>podatki</w:t>
+      </w:r>
+      <w:proofErr w:type="spellEnd"/>
+      <w:r>
+        <w:rPr>
+          <w:lang w:val="en-GB"/>
+        </w:rPr>
+        <w:t xml:space="preserve"> pa v </w:t>
+      </w:r>
+      <w:proofErr w:type="spellStart"/>
+      <w:r>
+        <w:rPr>
+          <w:lang w:val="en-GB"/>
+        </w:rPr>
+        <w:t>seji</w:t>
+      </w:r>
+      <w:proofErr w:type="spellEnd"/>
+      <w:r>
+        <w:rPr>
+          <w:lang w:val="en-GB"/>
+        </w:rPr>
+        <w:t xml:space="preserve"> </w:t>
+      </w:r>
+      <w:proofErr w:type="spellStart"/>
+      <w:r>
+        <w:rPr>
+          <w:lang w:val="en-GB"/>
+        </w:rPr>
+        <w:t>brskalnika</w:t>
+      </w:r>
+      <w:proofErr w:type="spellEnd"/>
+      <w:r>
+        <w:rPr>
+          <w:lang w:val="en-GB"/>
+        </w:rPr>
+        <w:t>.</w:t>
+      </w:r>
+    </w:p>
+    <w:p>
+      <w:pPr>
+        <w:rPr>
+          <w:lang w:val="en-GB"/>
+        </w:rPr>
+      </w:pPr>
+    </w:p>
+    <w:p>
+      <w:pPr>
+        <w:pStyle w:val="Heading2"/>
+      </w:pPr>
+      <w:r>
         <w:t>Začetni zaslon</w:t>
       </w:r>
       <w:bookmarkEnd w:id="8"/>
@@ -5207,7 +5598,7 @@
     </w:p>
     <w:p>
       <w:pPr>
-        <w:pStyle w:val="Odstavekseznama"/>
+        <w:pStyle w:val="ListParagraph"/>
         <w:numPr>
           <w:ilvl w:val="0"/>
           <w:numId w:val="41"/>
@@ -5229,7 +5620,7 @@
     </w:p>
     <w:p>
       <w:pPr>
-        <w:pStyle w:val="Odstavekseznama"/>
+        <w:pStyle w:val="ListParagraph"/>
         <w:numPr>
           <w:ilvl w:val="0"/>
           <w:numId w:val="41"/>
@@ -5251,7 +5642,7 @@
     </w:p>
     <w:p>
       <w:pPr>
-        <w:pStyle w:val="Odstavekseznama"/>
+        <w:pStyle w:val="ListParagraph"/>
         <w:numPr>
           <w:ilvl w:val="0"/>
           <w:numId w:val="41"/>
@@ -5303,7 +5694,7 @@
     </w:p>
     <w:p>
       <w:pPr>
-        <w:pStyle w:val="Odstavekseznama"/>
+        <w:pStyle w:val="ListParagraph"/>
         <w:numPr>
           <w:ilvl w:val="0"/>
           <w:numId w:val="41"/>
@@ -5332,7 +5723,7 @@
     </w:p>
     <w:p>
       <w:pPr>
-        <w:pStyle w:val="Odstavekseznama"/>
+        <w:pStyle w:val="ListParagraph"/>
         <w:numPr>
           <w:ilvl w:val="1"/>
           <w:numId w:val="42"/>
@@ -5352,7 +5743,7 @@
     </w:p>
     <w:p>
       <w:pPr>
-        <w:pStyle w:val="Odstavekseznama"/>
+        <w:pStyle w:val="ListParagraph"/>
         <w:numPr>
           <w:ilvl w:val="1"/>
           <w:numId w:val="42"/>
@@ -5372,7 +5763,7 @@
     </w:p>
     <w:p>
       <w:pPr>
-        <w:pStyle w:val="Odstavekseznama"/>
+        <w:pStyle w:val="ListParagraph"/>
         <w:numPr>
           <w:ilvl w:val="1"/>
           <w:numId w:val="42"/>
@@ -5392,7 +5783,7 @@
     </w:p>
     <w:p>
       <w:pPr>
-        <w:pStyle w:val="Odstavekseznama"/>
+        <w:pStyle w:val="ListParagraph"/>
         <w:numPr>
           <w:ilvl w:val="1"/>
           <w:numId w:val="42"/>
@@ -5412,7 +5803,7 @@
     </w:p>
     <w:p>
       <w:pPr>
-        <w:pStyle w:val="Odstavekseznama"/>
+        <w:pStyle w:val="ListParagraph"/>
         <w:numPr>
           <w:ilvl w:val="1"/>
           <w:numId w:val="42"/>
@@ -5432,7 +5823,7 @@
     </w:p>
     <w:p>
       <w:pPr>
-        <w:pStyle w:val="Odstavekseznama"/>
+        <w:pStyle w:val="ListParagraph"/>
         <w:numPr>
           <w:ilvl w:val="1"/>
           <w:numId w:val="42"/>
@@ -5460,7 +5851,7 @@
     </w:p>
     <w:p>
       <w:pPr>
-        <w:pStyle w:val="Odstavekseznama"/>
+        <w:pStyle w:val="ListParagraph"/>
         <w:numPr>
           <w:ilvl w:val="0"/>
           <w:numId w:val="43"/>
@@ -5489,7 +5880,7 @@
     </w:p>
     <w:p>
       <w:pPr>
-        <w:pStyle w:val="Odstavekseznama"/>
+        <w:pStyle w:val="ListParagraph"/>
         <w:numPr>
           <w:ilvl w:val="0"/>
           <w:numId w:val="43"/>
@@ -5541,7 +5932,7 @@
     </w:p>
     <w:p>
       <w:pPr>
-        <w:pStyle w:val="Odstavekseznama"/>
+        <w:pStyle w:val="ListParagraph"/>
         <w:numPr>
           <w:ilvl w:val="0"/>
           <w:numId w:val="43"/>
@@ -5609,7 +6000,7 @@
     </w:p>
     <w:p>
       <w:pPr>
-        <w:pStyle w:val="Naslov2"/>
+        <w:pStyle w:val="Heading2"/>
       </w:pPr>
       <w:bookmarkStart w:id="9" w:name="_Toc200298681"/>
       <w:r>
@@ -5664,7 +6055,7 @@
     </w:p>
     <w:p>
       <w:pPr>
-        <w:pStyle w:val="Odstavekseznama"/>
+        <w:pStyle w:val="ListParagraph"/>
         <w:numPr>
           <w:ilvl w:val="0"/>
           <w:numId w:val="44"/>
@@ -5686,7 +6077,7 @@
     </w:p>
     <w:p>
       <w:pPr>
-        <w:pStyle w:val="Odstavekseznama"/>
+        <w:pStyle w:val="ListParagraph"/>
         <w:numPr>
           <w:ilvl w:val="0"/>
           <w:numId w:val="44"/>
@@ -5708,7 +6099,7 @@
     </w:p>
     <w:p>
       <w:pPr>
-        <w:pStyle w:val="Odstavekseznama"/>
+        <w:pStyle w:val="ListParagraph"/>
         <w:numPr>
           <w:ilvl w:val="0"/>
           <w:numId w:val="44"/>
@@ -5725,6 +6116,7 @@
           <w:sz w:val="24"/>
           <w:szCs w:val="24"/>
         </w:rPr>
+        <w:lastRenderedPageBreak/>
         <w:t>Skupna statistika</w:t>
       </w:r>
       <w:r>
@@ -5760,7 +6152,7 @@
     </w:p>
     <w:p>
       <w:pPr>
-        <w:pStyle w:val="Odstavekseznama"/>
+        <w:pStyle w:val="ListParagraph"/>
         <w:numPr>
           <w:ilvl w:val="0"/>
           <w:numId w:val="44"/>
@@ -5789,7 +6181,7 @@
     </w:p>
     <w:p>
       <w:pPr>
-        <w:pStyle w:val="Odstavekseznama"/>
+        <w:pStyle w:val="ListParagraph"/>
         <w:numPr>
           <w:ilvl w:val="0"/>
           <w:numId w:val="44"/>
@@ -5853,16 +6245,16 @@
     </w:p>
     <w:p>
       <w:pPr>
-        <w:pStyle w:val="Odstavekseznama"/>
-        <w:rPr>
-          <w:sz w:val="24"/>
-          <w:szCs w:val="24"/>
-        </w:rPr>
-      </w:pPr>
-    </w:p>
-    <w:p>
-      <w:pPr>
-        <w:pStyle w:val="Odstavekseznama"/>
+        <w:pStyle w:val="ListParagraph"/>
+        <w:rPr>
+          <w:sz w:val="24"/>
+          <w:szCs w:val="24"/>
+        </w:rPr>
+      </w:pPr>
+    </w:p>
+    <w:p>
+      <w:pPr>
+        <w:pStyle w:val="ListParagraph"/>
         <w:numPr>
           <w:ilvl w:val="0"/>
           <w:numId w:val="44"/>
@@ -5893,7 +6285,7 @@
     </w:p>
     <w:p>
       <w:pPr>
-        <w:pStyle w:val="Odstavekseznama"/>
+        <w:pStyle w:val="ListParagraph"/>
         <w:numPr>
           <w:ilvl w:val="0"/>
           <w:numId w:val="45"/>
@@ -5908,13 +6300,12 @@
           <w:sz w:val="24"/>
           <w:szCs w:val="24"/>
         </w:rPr>
-        <w:lastRenderedPageBreak/>
         <w:t>Posamezni kosi sestavljanke</w:t>
       </w:r>
     </w:p>
     <w:p>
       <w:pPr>
-        <w:pStyle w:val="Odstavekseznama"/>
+        <w:pStyle w:val="ListParagraph"/>
         <w:numPr>
           <w:ilvl w:val="0"/>
           <w:numId w:val="45"/>
@@ -5962,7 +6353,7 @@
     </w:p>
     <w:p>
       <w:pPr>
-        <w:pStyle w:val="Odstavekseznama"/>
+        <w:pStyle w:val="ListParagraph"/>
         <w:ind w:left="1068"/>
         <w:rPr>
           <w:sz w:val="24"/>
@@ -5972,7 +6363,7 @@
     </w:p>
     <w:p>
       <w:pPr>
-        <w:pStyle w:val="Odstavekseznama"/>
+        <w:pStyle w:val="ListParagraph"/>
         <w:numPr>
           <w:ilvl w:val="0"/>
           <w:numId w:val="46"/>
@@ -6045,7 +6436,7 @@
     </w:p>
     <w:p>
       <w:pPr>
-        <w:pStyle w:val="Naslov2"/>
+        <w:pStyle w:val="Heading2"/>
       </w:pPr>
       <w:bookmarkStart w:id="10" w:name="_Toc200298682"/>
       <w:r>
@@ -6086,7 +6477,7 @@
     </w:p>
     <w:p>
       <w:pPr>
-        <w:pStyle w:val="Odstavekseznama"/>
+        <w:pStyle w:val="ListParagraph"/>
         <w:numPr>
           <w:ilvl w:val="0"/>
           <w:numId w:val="46"/>
@@ -6108,7 +6499,7 @@
     </w:p>
     <w:p>
       <w:pPr>
-        <w:pStyle w:val="Odstavekseznama"/>
+        <w:pStyle w:val="ListParagraph"/>
         <w:numPr>
           <w:ilvl w:val="0"/>
           <w:numId w:val="46"/>
@@ -6130,7 +6521,7 @@
     </w:p>
     <w:p>
       <w:pPr>
-        <w:pStyle w:val="Odstavekseznama"/>
+        <w:pStyle w:val="ListParagraph"/>
         <w:numPr>
           <w:ilvl w:val="0"/>
           <w:numId w:val="46"/>
@@ -6182,7 +6573,7 @@
     </w:p>
     <w:p>
       <w:pPr>
-        <w:pStyle w:val="Odstavekseznama"/>
+        <w:pStyle w:val="ListParagraph"/>
         <w:numPr>
           <w:ilvl w:val="0"/>
           <w:numId w:val="46"/>
@@ -6220,16 +6611,16 @@
     </w:p>
     <w:p>
       <w:pPr>
-        <w:pStyle w:val="Odstavekseznama"/>
-        <w:rPr>
-          <w:sz w:val="24"/>
-          <w:szCs w:val="24"/>
-        </w:rPr>
-      </w:pPr>
-    </w:p>
-    <w:p>
-      <w:pPr>
-        <w:pStyle w:val="Odstavekseznama"/>
+        <w:pStyle w:val="ListParagraph"/>
+        <w:rPr>
+          <w:sz w:val="24"/>
+          <w:szCs w:val="24"/>
+        </w:rPr>
+      </w:pPr>
+    </w:p>
+    <w:p>
+      <w:pPr>
+        <w:pStyle w:val="ListParagraph"/>
         <w:numPr>
           <w:ilvl w:val="0"/>
           <w:numId w:val="46"/>
@@ -6274,7 +6665,7 @@
     </w:p>
     <w:p>
       <w:pPr>
-        <w:pStyle w:val="Odstavekseznama"/>
+        <w:pStyle w:val="ListParagraph"/>
         <w:numPr>
           <w:ilvl w:val="0"/>
           <w:numId w:val="47"/>
@@ -6294,7 +6685,7 @@
     </w:p>
     <w:p>
       <w:pPr>
-        <w:pStyle w:val="Odstavekseznama"/>
+        <w:pStyle w:val="ListParagraph"/>
         <w:numPr>
           <w:ilvl w:val="0"/>
           <w:numId w:val="47"/>
@@ -6314,7 +6705,7 @@
     </w:p>
     <w:p>
       <w:pPr>
-        <w:pStyle w:val="Odstavekseznama"/>
+        <w:pStyle w:val="ListParagraph"/>
         <w:numPr>
           <w:ilvl w:val="0"/>
           <w:numId w:val="47"/>
@@ -6334,7 +6725,7 @@
     </w:p>
     <w:p>
       <w:pPr>
-        <w:pStyle w:val="Odstavekseznama"/>
+        <w:pStyle w:val="ListParagraph"/>
         <w:ind w:left="820"/>
         <w:rPr>
           <w:sz w:val="24"/>
@@ -6344,7 +6735,7 @@
     </w:p>
     <w:p>
       <w:pPr>
-        <w:pStyle w:val="Odstavekseznama"/>
+        <w:pStyle w:val="ListParagraph"/>
         <w:numPr>
           <w:ilvl w:val="0"/>
           <w:numId w:val="49"/>
@@ -6380,7 +6771,7 @@
     </w:p>
     <w:p>
       <w:pPr>
-        <w:pStyle w:val="Odstavekseznama"/>
+        <w:pStyle w:val="ListParagraph"/>
         <w:numPr>
           <w:ilvl w:val="0"/>
           <w:numId w:val="49"/>
@@ -6409,7 +6800,7 @@
     </w:p>
     <w:p>
       <w:pPr>
-        <w:pStyle w:val="Odstavekseznama"/>
+        <w:pStyle w:val="ListParagraph"/>
         <w:numPr>
           <w:ilvl w:val="0"/>
           <w:numId w:val="49"/>
@@ -6438,7 +6829,7 @@
     </w:p>
     <w:p>
       <w:pPr>
-        <w:pStyle w:val="Odstavekseznama"/>
+        <w:pStyle w:val="ListParagraph"/>
         <w:numPr>
           <w:ilvl w:val="0"/>
           <w:numId w:val="49"/>
@@ -6467,7 +6858,7 @@
     </w:p>
     <w:p>
       <w:pPr>
-        <w:pStyle w:val="Odstavekseznama"/>
+        <w:pStyle w:val="ListParagraph"/>
         <w:numPr>
           <w:ilvl w:val="0"/>
           <w:numId w:val="49"/>
@@ -6519,7 +6910,7 @@
     </w:p>
     <w:p>
       <w:pPr>
-        <w:pStyle w:val="Odstavekseznama"/>
+        <w:pStyle w:val="ListParagraph"/>
         <w:numPr>
           <w:ilvl w:val="0"/>
           <w:numId w:val="49"/>
@@ -6578,11 +6969,10 @@
     <w:p/>
     <w:p>
       <w:pPr>
-        <w:pStyle w:val="Naslov1"/>
+        <w:pStyle w:val="Heading1"/>
       </w:pPr>
       <w:bookmarkStart w:id="11" w:name="_Toc200298683"/>
       <w:r>
-        <w:lastRenderedPageBreak/>
         <w:t>Struktura rešitve</w:t>
       </w:r>
       <w:bookmarkEnd w:id="11"/>
@@ -6977,11 +7367,10 @@
     <w:p/>
     <w:p>
       <w:pPr>
-        <w:pStyle w:val="Naslov1"/>
+        <w:pStyle w:val="Heading1"/>
       </w:pPr>
       <w:bookmarkStart w:id="12" w:name="_Toc200298684"/>
       <w:r>
-        <w:lastRenderedPageBreak/>
         <w:t>Zunanje odvisnosti aplikacije</w:t>
       </w:r>
       <w:bookmarkEnd w:id="12"/>
@@ -7641,6 +8030,7 @@
           <w:sz w:val="24"/>
           <w:szCs w:val="24"/>
         </w:rPr>
+        <w:lastRenderedPageBreak/>
         <w:t xml:space="preserve">Popoln seznam vseh odvisnosti (vključno s posrednimi) je dostopen v datoteki </w:t>
       </w:r>
       <w:proofErr w:type="spellStart"/>
@@ -7749,11 +8139,10 @@
     <w:p/>
     <w:p>
       <w:pPr>
-        <w:pStyle w:val="Naslov1"/>
+        <w:pStyle w:val="Heading1"/>
       </w:pPr>
       <w:bookmarkStart w:id="13" w:name="_Toc200298685"/>
       <w:r>
-        <w:lastRenderedPageBreak/>
         <w:t>Navodila za zagon</w:t>
       </w:r>
       <w:bookmarkEnd w:id="13"/>
@@ -8536,7 +8925,6 @@
           <w:sz w:val="28"/>
           <w:szCs w:val="28"/>
         </w:rPr>
-        <w:lastRenderedPageBreak/>
         <w:t>6. Zagon razvojnega strežnika</w:t>
       </w:r>
     </w:p>
@@ -8735,7 +9123,7 @@
       <w:hyperlink r:id="rId6" w:tgtFrame="_new" w:history="1">
         <w:r>
           <w:rPr>
-            <w:rStyle w:val="Hiperpovezava"/>
+            <w:rStyle w:val="Hyperlink"/>
             <w:sz w:val="24"/>
             <w:szCs w:val="24"/>
           </w:rPr>
@@ -8763,11 +9151,10 @@
     <w:p/>
     <w:p>
       <w:pPr>
-        <w:pStyle w:val="Naslov1"/>
+        <w:pStyle w:val="Heading1"/>
       </w:pPr>
       <w:bookmarkStart w:id="14" w:name="_Toc200298686"/>
       <w:r>
-        <w:lastRenderedPageBreak/>
         <w:t>Navodila za nadaljnji razvoj</w:t>
       </w:r>
       <w:bookmarkEnd w:id="14"/>
@@ -9244,11 +9631,10 @@
     <w:p/>
     <w:p>
       <w:pPr>
-        <w:pStyle w:val="Naslov1"/>
+        <w:pStyle w:val="Heading1"/>
       </w:pPr>
       <w:bookmarkStart w:id="15" w:name="_Toc200298687"/>
       <w:r>
-        <w:lastRenderedPageBreak/>
         <w:t>Odprte pomanjkljivosti in napake</w:t>
       </w:r>
       <w:bookmarkEnd w:id="15"/>
@@ -9275,7 +9661,7 @@
     </w:p>
     <w:p>
       <w:pPr>
-        <w:pStyle w:val="Odstavekseznama"/>
+        <w:pStyle w:val="ListParagraph"/>
         <w:numPr>
           <w:ilvl w:val="0"/>
           <w:numId w:val="14"/>
@@ -9323,7 +9709,7 @@
     </w:p>
     <w:p>
       <w:pPr>
-        <w:pStyle w:val="Odstavekseznama"/>
+        <w:pStyle w:val="ListParagraph"/>
         <w:numPr>
           <w:ilvl w:val="0"/>
           <w:numId w:val="14"/>
@@ -9343,7 +9729,7 @@
     </w:p>
     <w:p>
       <w:pPr>
-        <w:pStyle w:val="Odstavekseznama"/>
+        <w:pStyle w:val="ListParagraph"/>
         <w:numPr>
           <w:ilvl w:val="0"/>
           <w:numId w:val="14"/>
@@ -9563,11 +9949,10 @@
     </w:p>
     <w:p>
       <w:pPr>
-        <w:pStyle w:val="Naslov1"/>
+        <w:pStyle w:val="Heading1"/>
       </w:pPr>
       <w:bookmarkStart w:id="16" w:name="_Toc200298688"/>
       <w:r>
-        <w:lastRenderedPageBreak/>
         <w:t>Prevzem rešitve</w:t>
       </w:r>
       <w:bookmarkEnd w:id="16"/>
@@ -10373,6 +10758,7 @@
           <w:sz w:val="24"/>
           <w:szCs w:val="24"/>
         </w:rPr>
+        <w:lastRenderedPageBreak/>
         <w:t xml:space="preserve">Če projekt preide iz osebnega v organizacijski račun, je priporočena migracija </w:t>
       </w:r>
       <w:proofErr w:type="spellStart"/>
@@ -10424,7 +10810,6 @@
           <w:sz w:val="24"/>
           <w:szCs w:val="24"/>
         </w:rPr>
-        <w:lastRenderedPageBreak/>
         <w:t>4. Nadaljnje vzdrževanje in nadgradnje</w:t>
       </w:r>
     </w:p>
@@ -17443,15 +17828,15 @@
     <w:lsdException w:name="Unresolved Mention" w:semiHidden="1" w:unhideWhenUsed="1"/>
     <w:lsdException w:name="Smart Link" w:semiHidden="1" w:unhideWhenUsed="1"/>
   </w:latentStyles>
-  <w:style w:type="paragraph" w:default="1" w:styleId="Navaden">
+  <w:style w:type="paragraph" w:default="1" w:styleId="Normal">
     <w:name w:val="Normal"/>
     <w:qFormat/>
   </w:style>
-  <w:style w:type="paragraph" w:styleId="Naslov1">
+  <w:style w:type="paragraph" w:styleId="Heading1">
     <w:name w:val="heading 1"/>
-    <w:basedOn w:val="Navaden"/>
-    <w:next w:val="Navaden"/>
-    <w:link w:val="Naslov1Znak"/>
+    <w:basedOn w:val="Normal"/>
+    <w:next w:val="Normal"/>
+    <w:link w:val="Heading1Char"/>
     <w:uiPriority w:val="9"/>
     <w:qFormat/>
     <w:rsid w:val="00657E60"/>
@@ -17468,11 +17853,11 @@
       <w:szCs w:val="40"/>
     </w:rPr>
   </w:style>
-  <w:style w:type="paragraph" w:styleId="Naslov2">
+  <w:style w:type="paragraph" w:styleId="Heading2">
     <w:name w:val="heading 2"/>
-    <w:basedOn w:val="Navaden"/>
-    <w:next w:val="Navaden"/>
-    <w:link w:val="Naslov2Znak"/>
+    <w:basedOn w:val="Normal"/>
+    <w:next w:val="Normal"/>
+    <w:link w:val="Heading2Char"/>
     <w:uiPriority w:val="9"/>
     <w:unhideWhenUsed/>
     <w:qFormat/>
@@ -17490,11 +17875,11 @@
       <w:szCs w:val="32"/>
     </w:rPr>
   </w:style>
-  <w:style w:type="paragraph" w:styleId="Naslov3">
+  <w:style w:type="paragraph" w:styleId="Heading3">
     <w:name w:val="heading 3"/>
-    <w:basedOn w:val="Navaden"/>
-    <w:next w:val="Navaden"/>
-    <w:link w:val="Naslov3Znak"/>
+    <w:basedOn w:val="Normal"/>
+    <w:next w:val="Normal"/>
+    <w:link w:val="Heading3Char"/>
     <w:uiPriority w:val="9"/>
     <w:unhideWhenUsed/>
     <w:qFormat/>
@@ -17512,11 +17897,11 @@
       <w:szCs w:val="28"/>
     </w:rPr>
   </w:style>
-  <w:style w:type="paragraph" w:styleId="Naslov4">
+  <w:style w:type="paragraph" w:styleId="Heading4">
     <w:name w:val="heading 4"/>
-    <w:basedOn w:val="Navaden"/>
-    <w:next w:val="Navaden"/>
-    <w:link w:val="Naslov4Znak"/>
+    <w:basedOn w:val="Normal"/>
+    <w:next w:val="Normal"/>
+    <w:link w:val="Heading4Char"/>
     <w:uiPriority w:val="9"/>
     <w:semiHidden/>
     <w:unhideWhenUsed/>
@@ -17535,11 +17920,11 @@
       <w:color w:val="0F4761" w:themeColor="accent1" w:themeShade="BF"/>
     </w:rPr>
   </w:style>
-  <w:style w:type="paragraph" w:styleId="Naslov5">
+  <w:style w:type="paragraph" w:styleId="Heading5">
     <w:name w:val="heading 5"/>
-    <w:basedOn w:val="Navaden"/>
-    <w:next w:val="Navaden"/>
-    <w:link w:val="Naslov5Znak"/>
+    <w:basedOn w:val="Normal"/>
+    <w:next w:val="Normal"/>
+    <w:link w:val="Heading5Char"/>
     <w:uiPriority w:val="9"/>
     <w:semiHidden/>
     <w:unhideWhenUsed/>
@@ -17556,11 +17941,11 @@
       <w:color w:val="0F4761" w:themeColor="accent1" w:themeShade="BF"/>
     </w:rPr>
   </w:style>
-  <w:style w:type="paragraph" w:styleId="Naslov6">
+  <w:style w:type="paragraph" w:styleId="Heading6">
     <w:name w:val="heading 6"/>
-    <w:basedOn w:val="Navaden"/>
-    <w:next w:val="Navaden"/>
-    <w:link w:val="Naslov6Znak"/>
+    <w:basedOn w:val="Normal"/>
+    <w:next w:val="Normal"/>
+    <w:link w:val="Heading6Char"/>
     <w:uiPriority w:val="9"/>
     <w:semiHidden/>
     <w:unhideWhenUsed/>
@@ -17579,11 +17964,11 @@
       <w:color w:val="595959" w:themeColor="text1" w:themeTint="A6"/>
     </w:rPr>
   </w:style>
-  <w:style w:type="paragraph" w:styleId="Naslov7">
+  <w:style w:type="paragraph" w:styleId="Heading7">
     <w:name w:val="heading 7"/>
-    <w:basedOn w:val="Navaden"/>
-    <w:next w:val="Navaden"/>
-    <w:link w:val="Naslov7Znak"/>
+    <w:basedOn w:val="Normal"/>
+    <w:next w:val="Normal"/>
+    <w:link w:val="Heading7Char"/>
     <w:uiPriority w:val="9"/>
     <w:semiHidden/>
     <w:unhideWhenUsed/>
@@ -17600,11 +17985,11 @@
       <w:color w:val="595959" w:themeColor="text1" w:themeTint="A6"/>
     </w:rPr>
   </w:style>
-  <w:style w:type="paragraph" w:styleId="Naslov8">
+  <w:style w:type="paragraph" w:styleId="Heading8">
     <w:name w:val="heading 8"/>
-    <w:basedOn w:val="Navaden"/>
-    <w:next w:val="Navaden"/>
-    <w:link w:val="Naslov8Znak"/>
+    <w:basedOn w:val="Normal"/>
+    <w:next w:val="Normal"/>
+    <w:link w:val="Heading8Char"/>
     <w:uiPriority w:val="9"/>
     <w:semiHidden/>
     <w:unhideWhenUsed/>
@@ -17623,11 +18008,11 @@
       <w:color w:val="272727" w:themeColor="text1" w:themeTint="D8"/>
     </w:rPr>
   </w:style>
-  <w:style w:type="paragraph" w:styleId="Naslov9">
+  <w:style w:type="paragraph" w:styleId="Heading9">
     <w:name w:val="heading 9"/>
-    <w:basedOn w:val="Navaden"/>
-    <w:next w:val="Navaden"/>
-    <w:link w:val="Naslov9Znak"/>
+    <w:basedOn w:val="Normal"/>
+    <w:next w:val="Normal"/>
+    <w:link w:val="Heading9Char"/>
     <w:uiPriority w:val="9"/>
     <w:semiHidden/>
     <w:unhideWhenUsed/>
@@ -17644,13 +18029,13 @@
       <w:color w:val="272727" w:themeColor="text1" w:themeTint="D8"/>
     </w:rPr>
   </w:style>
-  <w:style w:type="character" w:default="1" w:styleId="Privzetapisavaodstavka">
+  <w:style w:type="character" w:default="1" w:styleId="DefaultParagraphFont">
     <w:name w:val="Default Paragraph Font"/>
     <w:uiPriority w:val="1"/>
     <w:semiHidden/>
     <w:unhideWhenUsed/>
   </w:style>
-  <w:style w:type="table" w:default="1" w:styleId="Navadnatabela">
+  <w:style w:type="table" w:default="1" w:styleId="TableNormal">
     <w:name w:val="Normal Table"/>
     <w:uiPriority w:val="99"/>
     <w:semiHidden/>
@@ -17665,16 +18050,16 @@
       </w:tblCellMar>
     </w:tblPr>
   </w:style>
-  <w:style w:type="numbering" w:default="1" w:styleId="Brezseznama">
+  <w:style w:type="numbering" w:default="1" w:styleId="NoList">
     <w:name w:val="No List"/>
     <w:uiPriority w:val="99"/>
     <w:semiHidden/>
     <w:unhideWhenUsed/>
   </w:style>
-  <w:style w:type="character" w:customStyle="1" w:styleId="Naslov1Znak">
-    <w:name w:val="Naslov 1 Znak"/>
-    <w:basedOn w:val="Privzetapisavaodstavka"/>
-    <w:link w:val="Naslov1"/>
+  <w:style w:type="character" w:customStyle="1" w:styleId="Heading1Char">
+    <w:name w:val="Heading 1 Char"/>
+    <w:basedOn w:val="DefaultParagraphFont"/>
+    <w:link w:val="Heading1"/>
     <w:uiPriority w:val="9"/>
     <w:rsid w:val="00657E60"/>
     <w:rPr>
@@ -17684,10 +18069,10 @@
       <w:szCs w:val="40"/>
     </w:rPr>
   </w:style>
-  <w:style w:type="character" w:customStyle="1" w:styleId="Naslov2Znak">
-    <w:name w:val="Naslov 2 Znak"/>
-    <w:basedOn w:val="Privzetapisavaodstavka"/>
-    <w:link w:val="Naslov2"/>
+  <w:style w:type="character" w:customStyle="1" w:styleId="Heading2Char">
+    <w:name w:val="Heading 2 Char"/>
+    <w:basedOn w:val="DefaultParagraphFont"/>
+    <w:link w:val="Heading2"/>
     <w:uiPriority w:val="9"/>
     <w:rsid w:val="00657E60"/>
     <w:rPr>
@@ -17697,10 +18082,10 @@
       <w:szCs w:val="32"/>
     </w:rPr>
   </w:style>
-  <w:style w:type="character" w:customStyle="1" w:styleId="Naslov3Znak">
-    <w:name w:val="Naslov 3 Znak"/>
-    <w:basedOn w:val="Privzetapisavaodstavka"/>
-    <w:link w:val="Naslov3"/>
+  <w:style w:type="character" w:customStyle="1" w:styleId="Heading3Char">
+    <w:name w:val="Heading 3 Char"/>
+    <w:basedOn w:val="DefaultParagraphFont"/>
+    <w:link w:val="Heading3"/>
     <w:uiPriority w:val="9"/>
     <w:rsid w:val="00657E60"/>
     <w:rPr>
@@ -17710,10 +18095,10 @@
       <w:szCs w:val="28"/>
     </w:rPr>
   </w:style>
-  <w:style w:type="character" w:customStyle="1" w:styleId="Naslov4Znak">
-    <w:name w:val="Naslov 4 Znak"/>
-    <w:basedOn w:val="Privzetapisavaodstavka"/>
-    <w:link w:val="Naslov4"/>
+  <w:style w:type="character" w:customStyle="1" w:styleId="Heading4Char">
+    <w:name w:val="Heading 4 Char"/>
+    <w:basedOn w:val="DefaultParagraphFont"/>
+    <w:link w:val="Heading4"/>
     <w:uiPriority w:val="9"/>
     <w:semiHidden/>
     <w:rsid w:val="00657E60"/>
@@ -17724,10 +18109,10 @@
       <w:color w:val="0F4761" w:themeColor="accent1" w:themeShade="BF"/>
     </w:rPr>
   </w:style>
-  <w:style w:type="character" w:customStyle="1" w:styleId="Naslov5Znak">
-    <w:name w:val="Naslov 5 Znak"/>
-    <w:basedOn w:val="Privzetapisavaodstavka"/>
-    <w:link w:val="Naslov5"/>
+  <w:style w:type="character" w:customStyle="1" w:styleId="Heading5Char">
+    <w:name w:val="Heading 5 Char"/>
+    <w:basedOn w:val="DefaultParagraphFont"/>
+    <w:link w:val="Heading5"/>
     <w:uiPriority w:val="9"/>
     <w:semiHidden/>
     <w:rsid w:val="00657E60"/>
@@ -17736,10 +18121,10 @@
       <w:color w:val="0F4761" w:themeColor="accent1" w:themeShade="BF"/>
     </w:rPr>
   </w:style>
-  <w:style w:type="character" w:customStyle="1" w:styleId="Naslov6Znak">
-    <w:name w:val="Naslov 6 Znak"/>
-    <w:basedOn w:val="Privzetapisavaodstavka"/>
-    <w:link w:val="Naslov6"/>
+  <w:style w:type="character" w:customStyle="1" w:styleId="Heading6Char">
+    <w:name w:val="Heading 6 Char"/>
+    <w:basedOn w:val="DefaultParagraphFont"/>
+    <w:link w:val="Heading6"/>
     <w:uiPriority w:val="9"/>
     <w:semiHidden/>
     <w:rsid w:val="00657E60"/>
@@ -17750,10 +18135,10 @@
       <w:color w:val="595959" w:themeColor="text1" w:themeTint="A6"/>
     </w:rPr>
   </w:style>
-  <w:style w:type="character" w:customStyle="1" w:styleId="Naslov7Znak">
-    <w:name w:val="Naslov 7 Znak"/>
-    <w:basedOn w:val="Privzetapisavaodstavka"/>
-    <w:link w:val="Naslov7"/>
+  <w:style w:type="character" w:customStyle="1" w:styleId="Heading7Char">
+    <w:name w:val="Heading 7 Char"/>
+    <w:basedOn w:val="DefaultParagraphFont"/>
+    <w:link w:val="Heading7"/>
     <w:uiPriority w:val="9"/>
     <w:semiHidden/>
     <w:rsid w:val="00657E60"/>
@@ -17762,10 +18147,10 @@
       <w:color w:val="595959" w:themeColor="text1" w:themeTint="A6"/>
     </w:rPr>
   </w:style>
-  <w:style w:type="character" w:customStyle="1" w:styleId="Naslov8Znak">
-    <w:name w:val="Naslov 8 Znak"/>
-    <w:basedOn w:val="Privzetapisavaodstavka"/>
-    <w:link w:val="Naslov8"/>
+  <w:style w:type="character" w:customStyle="1" w:styleId="Heading8Char">
+    <w:name w:val="Heading 8 Char"/>
+    <w:basedOn w:val="DefaultParagraphFont"/>
+    <w:link w:val="Heading8"/>
     <w:uiPriority w:val="9"/>
     <w:semiHidden/>
     <w:rsid w:val="00657E60"/>
@@ -17776,10 +18161,10 @@
       <w:color w:val="272727" w:themeColor="text1" w:themeTint="D8"/>
     </w:rPr>
   </w:style>
-  <w:style w:type="character" w:customStyle="1" w:styleId="Naslov9Znak">
-    <w:name w:val="Naslov 9 Znak"/>
-    <w:basedOn w:val="Privzetapisavaodstavka"/>
-    <w:link w:val="Naslov9"/>
+  <w:style w:type="character" w:customStyle="1" w:styleId="Heading9Char">
+    <w:name w:val="Heading 9 Char"/>
+    <w:basedOn w:val="DefaultParagraphFont"/>
+    <w:link w:val="Heading9"/>
     <w:uiPriority w:val="9"/>
     <w:semiHidden/>
     <w:rsid w:val="00657E60"/>
@@ -17788,11 +18173,11 @@
       <w:color w:val="272727" w:themeColor="text1" w:themeTint="D8"/>
     </w:rPr>
   </w:style>
-  <w:style w:type="paragraph" w:styleId="Naslov">
+  <w:style w:type="paragraph" w:styleId="Title">
     <w:name w:val="Title"/>
-    <w:basedOn w:val="Navaden"/>
-    <w:next w:val="Navaden"/>
-    <w:link w:val="NaslovZnak"/>
+    <w:basedOn w:val="Normal"/>
+    <w:next w:val="Normal"/>
+    <w:link w:val="TitleChar"/>
     <w:uiPriority w:val="10"/>
     <w:qFormat/>
     <w:rsid w:val="00657E60"/>
@@ -17808,10 +18193,10 @@
       <w:szCs w:val="56"/>
     </w:rPr>
   </w:style>
-  <w:style w:type="character" w:customStyle="1" w:styleId="NaslovZnak">
-    <w:name w:val="Naslov Znak"/>
-    <w:basedOn w:val="Privzetapisavaodstavka"/>
-    <w:link w:val="Naslov"/>
+  <w:style w:type="character" w:customStyle="1" w:styleId="TitleChar">
+    <w:name w:val="Title Char"/>
+    <w:basedOn w:val="DefaultParagraphFont"/>
+    <w:link w:val="Title"/>
     <w:uiPriority w:val="10"/>
     <w:rsid w:val="00657E60"/>
     <w:rPr>
@@ -17822,11 +18207,11 @@
       <w:szCs w:val="56"/>
     </w:rPr>
   </w:style>
-  <w:style w:type="paragraph" w:styleId="Podnaslov">
+  <w:style w:type="paragraph" w:styleId="Subtitle">
     <w:name w:val="Subtitle"/>
-    <w:basedOn w:val="Navaden"/>
-    <w:next w:val="Navaden"/>
-    <w:link w:val="PodnaslovZnak"/>
+    <w:basedOn w:val="Normal"/>
+    <w:next w:val="Normal"/>
+    <w:link w:val="SubtitleChar"/>
     <w:uiPriority w:val="11"/>
     <w:qFormat/>
     <w:rsid w:val="00657E60"/>
@@ -17843,10 +18228,10 @@
       <w:szCs w:val="28"/>
     </w:rPr>
   </w:style>
-  <w:style w:type="character" w:customStyle="1" w:styleId="PodnaslovZnak">
-    <w:name w:val="Podnaslov Znak"/>
-    <w:basedOn w:val="Privzetapisavaodstavka"/>
-    <w:link w:val="Podnaslov"/>
+  <w:style w:type="character" w:customStyle="1" w:styleId="SubtitleChar">
+    <w:name w:val="Subtitle Char"/>
+    <w:basedOn w:val="DefaultParagraphFont"/>
+    <w:link w:val="Subtitle"/>
     <w:uiPriority w:val="11"/>
     <w:rsid w:val="00657E60"/>
     <w:rPr>
@@ -17857,11 +18242,11 @@
       <w:szCs w:val="28"/>
     </w:rPr>
   </w:style>
-  <w:style w:type="paragraph" w:styleId="Citat">
+  <w:style w:type="paragraph" w:styleId="Quote">
     <w:name w:val="Quote"/>
-    <w:basedOn w:val="Navaden"/>
-    <w:next w:val="Navaden"/>
-    <w:link w:val="CitatZnak"/>
+    <w:basedOn w:val="Normal"/>
+    <w:next w:val="Normal"/>
+    <w:link w:val="QuoteChar"/>
     <w:uiPriority w:val="29"/>
     <w:qFormat/>
     <w:rsid w:val="00657E60"/>
@@ -17875,10 +18260,10 @@
       <w:color w:val="404040" w:themeColor="text1" w:themeTint="BF"/>
     </w:rPr>
   </w:style>
-  <w:style w:type="character" w:customStyle="1" w:styleId="CitatZnak">
-    <w:name w:val="Citat Znak"/>
-    <w:basedOn w:val="Privzetapisavaodstavka"/>
-    <w:link w:val="Citat"/>
+  <w:style w:type="character" w:customStyle="1" w:styleId="QuoteChar">
+    <w:name w:val="Quote Char"/>
+    <w:basedOn w:val="DefaultParagraphFont"/>
+    <w:link w:val="Quote"/>
     <w:uiPriority w:val="29"/>
     <w:rsid w:val="00657E60"/>
     <w:rPr>
@@ -17887,9 +18272,9 @@
       <w:color w:val="404040" w:themeColor="text1" w:themeTint="BF"/>
     </w:rPr>
   </w:style>
-  <w:style w:type="paragraph" w:styleId="Odstavekseznama">
+  <w:style w:type="paragraph" w:styleId="ListParagraph">
     <w:name w:val="List Paragraph"/>
-    <w:basedOn w:val="Navaden"/>
+    <w:basedOn w:val="Normal"/>
     <w:uiPriority w:val="34"/>
     <w:qFormat/>
     <w:rsid w:val="00657E60"/>
@@ -17898,9 +18283,9 @@
       <w:contextualSpacing/>
     </w:pPr>
   </w:style>
-  <w:style w:type="character" w:styleId="Intenzivenpoudarek">
+  <w:style w:type="character" w:styleId="IntenseEmphasis">
     <w:name w:val="Intense Emphasis"/>
-    <w:basedOn w:val="Privzetapisavaodstavka"/>
+    <w:basedOn w:val="DefaultParagraphFont"/>
     <w:uiPriority w:val="21"/>
     <w:qFormat/>
     <w:rsid w:val="00657E60"/>
@@ -17910,11 +18295,11 @@
       <w:color w:val="0F4761" w:themeColor="accent1" w:themeShade="BF"/>
     </w:rPr>
   </w:style>
-  <w:style w:type="paragraph" w:styleId="Intenzivencitat">
+  <w:style w:type="paragraph" w:styleId="IntenseQuote">
     <w:name w:val="Intense Quote"/>
-    <w:basedOn w:val="Navaden"/>
-    <w:next w:val="Navaden"/>
-    <w:link w:val="IntenzivencitatZnak"/>
+    <w:basedOn w:val="Normal"/>
+    <w:next w:val="Normal"/>
+    <w:link w:val="IntenseQuoteChar"/>
     <w:uiPriority w:val="30"/>
     <w:qFormat/>
     <w:rsid w:val="00657E60"/>
@@ -17933,10 +18318,10 @@
       <w:color w:val="0F4761" w:themeColor="accent1" w:themeShade="BF"/>
     </w:rPr>
   </w:style>
-  <w:style w:type="character" w:customStyle="1" w:styleId="IntenzivencitatZnak">
-    <w:name w:val="Intenziven citat Znak"/>
-    <w:basedOn w:val="Privzetapisavaodstavka"/>
-    <w:link w:val="Intenzivencitat"/>
+  <w:style w:type="character" w:customStyle="1" w:styleId="IntenseQuoteChar">
+    <w:name w:val="Intense Quote Char"/>
+    <w:basedOn w:val="DefaultParagraphFont"/>
+    <w:link w:val="IntenseQuote"/>
     <w:uiPriority w:val="30"/>
     <w:rsid w:val="00657E60"/>
     <w:rPr>
@@ -17945,9 +18330,9 @@
       <w:color w:val="0F4761" w:themeColor="accent1" w:themeShade="BF"/>
     </w:rPr>
   </w:style>
-  <w:style w:type="character" w:styleId="Intenzivensklic">
+  <w:style w:type="character" w:styleId="IntenseReference">
     <w:name w:val="Intense Reference"/>
-    <w:basedOn w:val="Privzetapisavaodstavka"/>
+    <w:basedOn w:val="DefaultParagraphFont"/>
     <w:uiPriority w:val="32"/>
     <w:qFormat/>
     <w:rsid w:val="00657E60"/>
@@ -17959,10 +18344,10 @@
       <w:spacing w:val="5"/>
     </w:rPr>
   </w:style>
-  <w:style w:type="paragraph" w:styleId="NaslovTOC">
+  <w:style w:type="paragraph" w:styleId="TOCHeading">
     <w:name w:val="TOC Heading"/>
-    <w:basedOn w:val="Naslov1"/>
-    <w:next w:val="Navaden"/>
+    <w:basedOn w:val="Heading1"/>
+    <w:next w:val="Normal"/>
     <w:uiPriority w:val="39"/>
     <w:unhideWhenUsed/>
     <w:qFormat/>
@@ -17979,10 +18364,10 @@
       <w14:ligatures w14:val="none"/>
     </w:rPr>
   </w:style>
-  <w:style w:type="paragraph" w:styleId="Kazalovsebine1">
+  <w:style w:type="paragraph" w:styleId="TOC1">
     <w:name w:val="toc 1"/>
-    <w:basedOn w:val="Navaden"/>
-    <w:next w:val="Navaden"/>
+    <w:basedOn w:val="Normal"/>
+    <w:next w:val="Normal"/>
     <w:autoRedefine/>
     <w:uiPriority w:val="39"/>
     <w:unhideWhenUsed/>
@@ -17991,9 +18376,9 @@
       <w:spacing w:after="100"/>
     </w:pPr>
   </w:style>
-  <w:style w:type="character" w:styleId="Hiperpovezava">
+  <w:style w:type="character" w:styleId="Hyperlink">
     <w:name w:val="Hyperlink"/>
-    <w:basedOn w:val="Privzetapisavaodstavka"/>
+    <w:basedOn w:val="DefaultParagraphFont"/>
     <w:uiPriority w:val="99"/>
     <w:unhideWhenUsed/>
     <w:rsid w:val="00B16574"/>
@@ -18002,9 +18387,9 @@
       <w:u w:val="single"/>
     </w:rPr>
   </w:style>
-  <w:style w:type="character" w:styleId="Nerazreenaomemba">
+  <w:style w:type="character" w:styleId="UnresolvedMention">
     <w:name w:val="Unresolved Mention"/>
-    <w:basedOn w:val="Privzetapisavaodstavka"/>
+    <w:basedOn w:val="DefaultParagraphFont"/>
     <w:uiPriority w:val="99"/>
     <w:semiHidden/>
     <w:unhideWhenUsed/>
@@ -18014,10 +18399,10 @@
       <w:shd w:val="clear" w:color="auto" w:fill="E1DFDD"/>
     </w:rPr>
   </w:style>
-  <w:style w:type="paragraph" w:styleId="Kazalovsebine2">
+  <w:style w:type="paragraph" w:styleId="TOC2">
     <w:name w:val="toc 2"/>
-    <w:basedOn w:val="Navaden"/>
-    <w:next w:val="Navaden"/>
+    <w:basedOn w:val="Normal"/>
+    <w:next w:val="Normal"/>
     <w:autoRedefine/>
     <w:uiPriority w:val="39"/>
     <w:unhideWhenUsed/>

</xml_diff>

<commit_message>
Final BUG FIX: Vercel linting
</commit_message>
<xml_diff>
--- a/docs/dokumentacija.docx
+++ b/docs/dokumentacija.docx
@@ -2128,38 +2128,6 @@
     </w:p>
     <w:p>
       <w:pPr>
-        <w:rPr>
-          <w:sz w:val="28"/>
-          <w:szCs w:val="28"/>
-        </w:rPr>
-      </w:pPr>
-    </w:p>
-    <w:p>
-      <w:pPr>
-        <w:rPr>
-          <w:sz w:val="28"/>
-          <w:szCs w:val="28"/>
-        </w:rPr>
-      </w:pPr>
-    </w:p>
-    <w:p>
-      <w:pPr>
-        <w:rPr>
-          <w:sz w:val="28"/>
-          <w:szCs w:val="28"/>
-        </w:rPr>
-      </w:pPr>
-    </w:p>
-    <w:p>
-      <w:pPr>
-        <w:rPr>
-          <w:sz w:val="28"/>
-          <w:szCs w:val="28"/>
-        </w:rPr>
-      </w:pPr>
-    </w:p>
-    <w:p>
-      <w:pPr>
         <w:pStyle w:val="Heading1"/>
       </w:pPr>
       <w:bookmarkStart w:id="0" w:name="_Toc200308702"/>
@@ -3329,70 +3297,6 @@
     </w:p>
     <w:p>
       <w:pPr>
-        <w:rPr>
-          <w:sz w:val="24"/>
-          <w:szCs w:val="24"/>
-        </w:rPr>
-      </w:pPr>
-    </w:p>
-    <w:p>
-      <w:pPr>
-        <w:rPr>
-          <w:sz w:val="24"/>
-          <w:szCs w:val="24"/>
-        </w:rPr>
-      </w:pPr>
-    </w:p>
-    <w:p>
-      <w:pPr>
-        <w:rPr>
-          <w:sz w:val="24"/>
-          <w:szCs w:val="24"/>
-        </w:rPr>
-      </w:pPr>
-    </w:p>
-    <w:p>
-      <w:pPr>
-        <w:rPr>
-          <w:sz w:val="24"/>
-          <w:szCs w:val="24"/>
-        </w:rPr>
-      </w:pPr>
-    </w:p>
-    <w:p>
-      <w:pPr>
-        <w:rPr>
-          <w:sz w:val="24"/>
-          <w:szCs w:val="24"/>
-        </w:rPr>
-      </w:pPr>
-    </w:p>
-    <w:p>
-      <w:pPr>
-        <w:rPr>
-          <w:sz w:val="24"/>
-          <w:szCs w:val="24"/>
-        </w:rPr>
-      </w:pPr>
-    </w:p>
-    <w:p>
-      <w:pPr>
-        <w:rPr>
-          <w:sz w:val="24"/>
-          <w:szCs w:val="24"/>
-        </w:rPr>
-      </w:pPr>
-    </w:p>
-    <w:p>
-      <w:pPr>
-        <w:rPr>
-          <w:sz w:val="24"/>
-          <w:szCs w:val="24"/>
-        </w:rPr>
-      </w:pPr>
-    </w:p>
-    <w:p>
-      <w:pPr>
         <w:pStyle w:val="Heading2"/>
       </w:pPr>
       <w:bookmarkStart w:id="3" w:name="_Toc200308705"/>
@@ -5030,10 +4934,6 @@
         <w:t>Učinkovito upravljanje stanja aplikacije</w:t>
       </w:r>
     </w:p>
-    <w:p/>
-    <w:p/>
-    <w:p/>
-    <w:p/>
     <w:p/>
     <w:p/>
     <w:p/>
@@ -5573,9 +5473,6 @@
         <w:t xml:space="preserve"> SDK-ja za neposredno komunikacijo s strežniško platformo.</w:t>
       </w:r>
     </w:p>
-    <w:p/>
-    <w:p/>
-    <w:p/>
     <w:p/>
     <w:p/>
     <w:p/>

</xml_diff>